<commit_message>
answers to reviewer 1 before grammar check
</commit_message>
<xml_diff>
--- a/submission_to_autonomous_intelligent_systems/re_submission/response.docx
+++ b/submission_to_autonomous_intelligent_systems/re_submission/response.docx
@@ -404,10 +404,9 @@
         <w:contextualSpacing w:val="0"/>
         <w:rPr>
           <w:rFonts w:eastAsia="Times New Roman" w:cs="Arial"/>
-          <w:color w:val="4472C4" w:themeColor="accent5"/>
-          <w:spacing w:val="0"/>
-          <w:szCs w:val="20"/>
-          <w:lang w:val="de-DE" w:eastAsia="de-DE" w:bidi="ar-SA"/>
+          <w:spacing w:val="0"/>
+          <w:szCs w:val="20"/>
+          <w:lang w:val="en-AU" w:eastAsia="de-DE" w:bidi="ar-SA"/>
         </w:rPr>
       </w:pPr>
       <w:r>
@@ -424,7 +423,7 @@
           <w:rFonts w:eastAsia="Times New Roman" w:cs="Arial"/>
           <w:spacing w:val="0"/>
           <w:szCs w:val="20"/>
-          <w:lang w:val="de-DE" w:eastAsia="de-DE" w:bidi="ar-SA"/>
+          <w:lang w:val="en-AU" w:eastAsia="de-DE" w:bidi="ar-SA"/>
         </w:rPr>
         <w:t xml:space="preserve"> </w:t>
       </w:r>
@@ -433,45 +432,218 @@
           <w:rFonts w:eastAsia="Times New Roman" w:cs="Arial"/>
           <w:spacing w:val="0"/>
           <w:szCs w:val="20"/>
-          <w:lang w:val="de-DE" w:eastAsia="de-DE" w:bidi="ar-SA"/>
-        </w:rPr>
-        <w:t xml:space="preserve">Sollten wir beantworten können. </w:t>
-      </w:r>
-      <w:r>
-        <w:rPr>
-          <w:rFonts w:eastAsia="Times New Roman" w:cs="Arial"/>
-          <w:spacing w:val="0"/>
-          <w:szCs w:val="20"/>
-          <w:lang w:val="de-DE" w:eastAsia="de-DE" w:bidi="ar-SA"/>
-        </w:rPr>
-        <w:t>Ggf. auch im Text drauf hinweisen, wenn wir eine gute Antwort haben</w:t>
-      </w:r>
-      <w:r>
-        <w:rPr>
-          <w:rFonts w:eastAsia="Times New Roman" w:cs="Arial"/>
-          <w:spacing w:val="0"/>
-          <w:szCs w:val="20"/>
-          <w:lang w:val="de-DE" w:eastAsia="de-DE" w:bidi="ar-SA"/>
-        </w:rPr>
-        <w:t>. Meine Interpretation: H Matrix ist eine Einheitsmatrix, weil wir die Eingangsdaten nicht umwandeln müssen. Die Objekte kriegen wir schon in unserem Koordinatensystem</w:t>
-      </w:r>
-      <w:r>
-        <w:rPr>
-          <w:rFonts w:eastAsia="Times New Roman" w:cs="Arial"/>
-          <w:spacing w:val="0"/>
-          <w:szCs w:val="20"/>
-          <w:lang w:val="de-DE" w:eastAsia="de-DE" w:bidi="ar-SA"/>
-        </w:rPr>
-        <w:t>. Noise bin ich mir noch unsicher.</w:t>
-      </w:r>
-      <w:r>
-        <w:rPr>
-          <w:rFonts w:eastAsia="Times New Roman" w:cs="Arial"/>
-          <w:spacing w:val="0"/>
-          <w:szCs w:val="20"/>
-          <w:lang w:val="de-DE" w:eastAsia="de-DE" w:bidi="ar-SA"/>
-        </w:rPr>
-        <w:t xml:space="preserve"> (MD)</w:t>
+          <w:lang w:val="en-AU" w:eastAsia="de-DE" w:bidi="ar-SA"/>
+        </w:rPr>
+        <w:t xml:space="preserve">For our Kalman set-up, the </w:t>
+      </w:r>
+      <w:r>
+        <w:rPr>
+          <w:rFonts w:eastAsia="Times New Roman" w:cs="Arial"/>
+          <w:spacing w:val="0"/>
+          <w:szCs w:val="20"/>
+          <w:lang w:val="en-AU" w:eastAsia="de-DE" w:bidi="ar-SA"/>
+        </w:rPr>
+        <w:t xml:space="preserve">predicted states from the SPENT network have the same </w:t>
+      </w:r>
+      <w:proofErr w:type="spellStart"/>
+      <w:r>
+        <w:rPr>
+          <w:rFonts w:eastAsia="Times New Roman" w:cs="Arial"/>
+          <w:spacing w:val="0"/>
+          <w:szCs w:val="20"/>
+          <w:lang w:val="en-AU" w:eastAsia="de-DE" w:bidi="ar-SA"/>
+        </w:rPr>
+        <w:t>repsentation</w:t>
+      </w:r>
+      <w:proofErr w:type="spellEnd"/>
+      <w:r>
+        <w:rPr>
+          <w:rFonts w:eastAsia="Times New Roman" w:cs="Arial"/>
+          <w:spacing w:val="0"/>
+          <w:szCs w:val="20"/>
+          <w:lang w:val="en-AU" w:eastAsia="de-DE" w:bidi="ar-SA"/>
+        </w:rPr>
+        <w:t xml:space="preserve"> as the sensor objects (relative coordinates to ego </w:t>
+      </w:r>
+      <w:r>
+        <w:rPr>
+          <w:rFonts w:eastAsia="Times New Roman" w:cs="Arial"/>
+          <w:spacing w:val="0"/>
+          <w:szCs w:val="20"/>
+          <w:lang w:val="en-AU" w:eastAsia="de-DE" w:bidi="ar-SA"/>
+        </w:rPr>
+        <w:t>within</w:t>
+      </w:r>
+      <w:r>
+        <w:rPr>
+          <w:rFonts w:eastAsia="Times New Roman" w:cs="Arial"/>
+          <w:spacing w:val="0"/>
+          <w:szCs w:val="20"/>
+          <w:lang w:val="en-AU" w:eastAsia="de-DE" w:bidi="ar-SA"/>
+        </w:rPr>
+        <w:t xml:space="preserve"> </w:t>
+      </w:r>
+      <w:r>
+        <w:rPr>
+          <w:rFonts w:eastAsia="Times New Roman" w:cs="Arial"/>
+          <w:spacing w:val="0"/>
+          <w:szCs w:val="20"/>
+          <w:lang w:val="en-AU" w:eastAsia="de-DE" w:bidi="ar-SA"/>
+        </w:rPr>
+        <w:t xml:space="preserve">a </w:t>
+      </w:r>
+      <w:r>
+        <w:rPr>
+          <w:rFonts w:eastAsia="Times New Roman" w:cs="Arial"/>
+          <w:spacing w:val="0"/>
+          <w:szCs w:val="20"/>
+          <w:lang w:val="en-AU" w:eastAsia="de-DE" w:bidi="ar-SA"/>
+        </w:rPr>
+        <w:t>five-dimensional</w:t>
+      </w:r>
+      <w:r>
+        <w:rPr>
+          <w:rFonts w:eastAsia="Times New Roman" w:cs="Arial"/>
+          <w:spacing w:val="0"/>
+          <w:szCs w:val="20"/>
+          <w:lang w:val="en-AU" w:eastAsia="de-DE" w:bidi="ar-SA"/>
+        </w:rPr>
+        <w:t xml:space="preserve"> state vector). </w:t>
+      </w:r>
+      <w:r>
+        <w:rPr>
+          <w:rFonts w:eastAsia="Times New Roman" w:cs="Arial"/>
+          <w:spacing w:val="0"/>
+          <w:szCs w:val="20"/>
+          <w:lang w:val="en-AU" w:eastAsia="de-DE" w:bidi="ar-SA"/>
+        </w:rPr>
+        <w:t>For us, t</w:t>
+      </w:r>
+      <w:r>
+        <w:rPr>
+          <w:rFonts w:eastAsia="Times New Roman" w:cs="Arial"/>
+          <w:spacing w:val="0"/>
+          <w:szCs w:val="20"/>
+          <w:lang w:val="en-AU" w:eastAsia="de-DE" w:bidi="ar-SA"/>
+        </w:rPr>
+        <w:t xml:space="preserve">he H </w:t>
+      </w:r>
+      <w:r>
+        <w:rPr>
+          <w:rFonts w:eastAsia="Times New Roman" w:cs="Arial"/>
+          <w:spacing w:val="0"/>
+          <w:szCs w:val="20"/>
+          <w:lang w:val="en-AU" w:eastAsia="de-DE" w:bidi="ar-SA"/>
+        </w:rPr>
+        <w:t xml:space="preserve">Matrix </w:t>
+      </w:r>
+      <w:r>
+        <w:rPr>
+          <w:rFonts w:eastAsia="Times New Roman" w:cs="Arial"/>
+          <w:spacing w:val="0"/>
+          <w:szCs w:val="20"/>
+          <w:lang w:val="en-AU" w:eastAsia="de-DE" w:bidi="ar-SA"/>
+        </w:rPr>
+        <w:t xml:space="preserve">in </w:t>
+      </w:r>
+      <w:r>
+        <w:rPr>
+          <w:rFonts w:eastAsia="Times New Roman" w:cs="Arial"/>
+          <w:spacing w:val="0"/>
+          <w:szCs w:val="20"/>
+          <w:lang w:val="en-AU" w:eastAsia="de-DE" w:bidi="ar-SA"/>
+        </w:rPr>
+        <w:t xml:space="preserve">the measurement equation is a </w:t>
+      </w:r>
+      <w:r>
+        <w:rPr>
+          <w:rFonts w:eastAsia="Times New Roman" w:cs="Arial"/>
+          <w:spacing w:val="0"/>
+          <w:szCs w:val="20"/>
+          <w:lang w:val="en-AU" w:eastAsia="de-DE" w:bidi="ar-SA"/>
+        </w:rPr>
+        <w:t>unit matrix</w:t>
+      </w:r>
+      <w:r>
+        <w:rPr>
+          <w:rFonts w:eastAsia="Times New Roman" w:cs="Arial"/>
+          <w:spacing w:val="0"/>
+          <w:szCs w:val="20"/>
+          <w:lang w:val="en-AU" w:eastAsia="de-DE" w:bidi="ar-SA"/>
+        </w:rPr>
+        <w:t xml:space="preserve"> and we set the</w:t>
+      </w:r>
+      <w:r>
+        <w:rPr>
+          <w:rFonts w:eastAsia="Times New Roman" w:cs="Arial"/>
+          <w:spacing w:val="0"/>
+          <w:szCs w:val="20"/>
+          <w:lang w:val="en-AU" w:eastAsia="de-DE" w:bidi="ar-SA"/>
+        </w:rPr>
+        <w:t xml:space="preserve"> </w:t>
+      </w:r>
+      <w:r>
+        <w:rPr>
+          <w:rFonts w:eastAsia="Times New Roman" w:cs="Arial"/>
+          <w:spacing w:val="0"/>
+          <w:szCs w:val="20"/>
+          <w:lang w:val="en-AU" w:eastAsia="de-DE" w:bidi="ar-SA"/>
+        </w:rPr>
+        <w:t xml:space="preserve">noise vector </w:t>
+      </w:r>
+      <w:r>
+        <w:rPr>
+          <w:rFonts w:eastAsia="Times New Roman" w:cs="Arial"/>
+          <w:spacing w:val="0"/>
+          <w:szCs w:val="20"/>
+          <w:lang w:val="en-AU" w:eastAsia="de-DE" w:bidi="ar-SA"/>
+        </w:rPr>
+        <w:t xml:space="preserve">to </w:t>
+      </w:r>
+      <w:r>
+        <w:rPr>
+          <w:rFonts w:eastAsia="Times New Roman" w:cs="Arial"/>
+          <w:spacing w:val="0"/>
+          <w:szCs w:val="20"/>
+          <w:lang w:val="en-AU" w:eastAsia="de-DE" w:bidi="ar-SA"/>
+        </w:rPr>
+        <w:t>zero</w:t>
+      </w:r>
+      <w:r>
+        <w:rPr>
+          <w:rFonts w:eastAsia="Times New Roman" w:cs="Arial"/>
+          <w:spacing w:val="0"/>
+          <w:szCs w:val="20"/>
+          <w:lang w:val="en-AU" w:eastAsia="de-DE" w:bidi="ar-SA"/>
+        </w:rPr>
+        <w:t>.</w:t>
+      </w:r>
+      <w:r>
+        <w:rPr>
+          <w:rFonts w:eastAsia="Times New Roman" w:cs="Arial"/>
+          <w:spacing w:val="0"/>
+          <w:szCs w:val="20"/>
+          <w:lang w:val="en-AU" w:eastAsia="de-DE" w:bidi="ar-SA"/>
+        </w:rPr>
+        <w:t xml:space="preserve"> </w:t>
+      </w:r>
+      <w:r>
+        <w:rPr>
+          <w:rFonts w:eastAsia="Times New Roman" w:cs="Arial"/>
+          <w:spacing w:val="0"/>
+          <w:szCs w:val="20"/>
+          <w:lang w:val="en-AU" w:eastAsia="de-DE" w:bidi="ar-SA"/>
+        </w:rPr>
+        <w:t>We extended the manuscript to make this clear for the reader</w:t>
+      </w:r>
+      <w:r>
+        <w:rPr>
+          <w:rFonts w:eastAsia="Times New Roman" w:cs="Arial"/>
+          <w:spacing w:val="0"/>
+          <w:szCs w:val="20"/>
+          <w:lang w:val="en-AU" w:eastAsia="de-DE" w:bidi="ar-SA"/>
+        </w:rPr>
+        <w:t xml:space="preserve"> (see IV, B.).</w:t>
       </w:r>
     </w:p>
     <w:p>
@@ -486,7 +658,7 @@
           <w:color w:val="4472C4" w:themeColor="accent5"/>
           <w:spacing w:val="0"/>
           <w:szCs w:val="20"/>
-          <w:lang w:val="de-DE" w:eastAsia="de-DE" w:bidi="ar-SA"/>
+          <w:lang w:val="en-AU" w:eastAsia="de-DE" w:bidi="ar-SA"/>
         </w:rPr>
       </w:pPr>
     </w:p>
@@ -502,7 +674,7 @@
           <w:color w:val="4472C4" w:themeColor="accent5"/>
           <w:spacing w:val="0"/>
           <w:szCs w:val="20"/>
-          <w:lang w:val="en-AU" w:eastAsia="de-DE" w:bidi="ar-SA"/>
+          <w:lang w:val="de-DE" w:eastAsia="de-DE" w:bidi="ar-SA"/>
         </w:rPr>
       </w:pPr>
       <w:r>
@@ -535,7 +707,127 @@
           <w:szCs w:val="20"/>
           <w:lang w:val="en-AU" w:eastAsia="de-DE" w:bidi="ar-SA"/>
         </w:rPr>
-        <w:t xml:space="preserve"> whether it is simple Gaussian white noise or a more complex type. This aspect requires more detailed explanation.</w:t>
+        <w:t xml:space="preserve"> whether it is simple Gaussian white noise or a more complex type. </w:t>
+      </w:r>
+      <w:r>
+        <w:rPr>
+          <w:rFonts w:eastAsia="Times New Roman" w:cs="Arial"/>
+          <w:color w:val="4472C4" w:themeColor="accent5"/>
+          <w:spacing w:val="0"/>
+          <w:szCs w:val="20"/>
+          <w:lang w:val="de-DE" w:eastAsia="de-DE" w:bidi="ar-SA"/>
+        </w:rPr>
+        <w:t xml:space="preserve">This </w:t>
+      </w:r>
+      <w:proofErr w:type="spellStart"/>
+      <w:r>
+        <w:rPr>
+          <w:rFonts w:eastAsia="Times New Roman" w:cs="Arial"/>
+          <w:color w:val="4472C4" w:themeColor="accent5"/>
+          <w:spacing w:val="0"/>
+          <w:szCs w:val="20"/>
+          <w:lang w:val="de-DE" w:eastAsia="de-DE" w:bidi="ar-SA"/>
+        </w:rPr>
+        <w:t>aspect</w:t>
+      </w:r>
+      <w:proofErr w:type="spellEnd"/>
+      <w:r>
+        <w:rPr>
+          <w:rFonts w:eastAsia="Times New Roman" w:cs="Arial"/>
+          <w:color w:val="4472C4" w:themeColor="accent5"/>
+          <w:spacing w:val="0"/>
+          <w:szCs w:val="20"/>
+          <w:lang w:val="de-DE" w:eastAsia="de-DE" w:bidi="ar-SA"/>
+        </w:rPr>
+        <w:t xml:space="preserve"> </w:t>
+      </w:r>
+      <w:proofErr w:type="spellStart"/>
+      <w:r>
+        <w:rPr>
+          <w:rFonts w:eastAsia="Times New Roman" w:cs="Arial"/>
+          <w:color w:val="4472C4" w:themeColor="accent5"/>
+          <w:spacing w:val="0"/>
+          <w:szCs w:val="20"/>
+          <w:lang w:val="de-DE" w:eastAsia="de-DE" w:bidi="ar-SA"/>
+        </w:rPr>
+        <w:t>requires</w:t>
+      </w:r>
+      <w:proofErr w:type="spellEnd"/>
+      <w:r>
+        <w:rPr>
+          <w:rFonts w:eastAsia="Times New Roman" w:cs="Arial"/>
+          <w:color w:val="4472C4" w:themeColor="accent5"/>
+          <w:spacing w:val="0"/>
+          <w:szCs w:val="20"/>
+          <w:lang w:val="de-DE" w:eastAsia="de-DE" w:bidi="ar-SA"/>
+        </w:rPr>
+        <w:t xml:space="preserve"> </w:t>
+      </w:r>
+      <w:proofErr w:type="spellStart"/>
+      <w:r>
+        <w:rPr>
+          <w:rFonts w:eastAsia="Times New Roman" w:cs="Arial"/>
+          <w:color w:val="4472C4" w:themeColor="accent5"/>
+          <w:spacing w:val="0"/>
+          <w:szCs w:val="20"/>
+          <w:lang w:val="de-DE" w:eastAsia="de-DE" w:bidi="ar-SA"/>
+        </w:rPr>
+        <w:t>more</w:t>
+      </w:r>
+      <w:proofErr w:type="spellEnd"/>
+      <w:r>
+        <w:rPr>
+          <w:rFonts w:eastAsia="Times New Roman" w:cs="Arial"/>
+          <w:color w:val="4472C4" w:themeColor="accent5"/>
+          <w:spacing w:val="0"/>
+          <w:szCs w:val="20"/>
+          <w:lang w:val="de-DE" w:eastAsia="de-DE" w:bidi="ar-SA"/>
+        </w:rPr>
+        <w:t xml:space="preserve"> </w:t>
+      </w:r>
+      <w:proofErr w:type="spellStart"/>
+      <w:r>
+        <w:rPr>
+          <w:rFonts w:eastAsia="Times New Roman" w:cs="Arial"/>
+          <w:color w:val="4472C4" w:themeColor="accent5"/>
+          <w:spacing w:val="0"/>
+          <w:szCs w:val="20"/>
+          <w:lang w:val="de-DE" w:eastAsia="de-DE" w:bidi="ar-SA"/>
+        </w:rPr>
+        <w:t>detailed</w:t>
+      </w:r>
+      <w:proofErr w:type="spellEnd"/>
+      <w:r>
+        <w:rPr>
+          <w:rFonts w:eastAsia="Times New Roman" w:cs="Arial"/>
+          <w:color w:val="4472C4" w:themeColor="accent5"/>
+          <w:spacing w:val="0"/>
+          <w:szCs w:val="20"/>
+          <w:lang w:val="de-DE" w:eastAsia="de-DE" w:bidi="ar-SA"/>
+        </w:rPr>
+        <w:t xml:space="preserve"> </w:t>
+      </w:r>
+      <w:proofErr w:type="spellStart"/>
+      <w:r>
+        <w:rPr>
+          <w:rFonts w:eastAsia="Times New Roman" w:cs="Arial"/>
+          <w:color w:val="4472C4" w:themeColor="accent5"/>
+          <w:spacing w:val="0"/>
+          <w:szCs w:val="20"/>
+          <w:lang w:val="de-DE" w:eastAsia="de-DE" w:bidi="ar-SA"/>
+        </w:rPr>
+        <w:t>explanation</w:t>
+      </w:r>
+      <w:proofErr w:type="spellEnd"/>
+      <w:r>
+        <w:rPr>
+          <w:rFonts w:eastAsia="Times New Roman" w:cs="Arial"/>
+          <w:color w:val="4472C4" w:themeColor="accent5"/>
+          <w:spacing w:val="0"/>
+          <w:szCs w:val="20"/>
+          <w:lang w:val="de-DE" w:eastAsia="de-DE" w:bidi="ar-SA"/>
+        </w:rPr>
+        <w:t>.</w:t>
       </w:r>
     </w:p>
     <w:p>
@@ -550,17 +842,26 @@
           <w:color w:val="4472C4" w:themeColor="accent5"/>
           <w:spacing w:val="0"/>
           <w:szCs w:val="20"/>
+          <w:lang w:val="en-AU" w:eastAsia="de-DE" w:bidi="ar-SA"/>
+        </w:rPr>
+      </w:pPr>
+      <w:r>
+        <w:rPr>
+          <w:rFonts w:eastAsia="Times New Roman" w:cs="Arial"/>
+          <w:spacing w:val="0"/>
+          <w:szCs w:val="20"/>
+          <w:lang w:val="en-AU" w:eastAsia="de-DE" w:bidi="ar-SA"/>
+        </w:rPr>
+        <w:sym w:font="Wingdings" w:char="F0E0"/>
+      </w:r>
+      <w:r>
+        <w:rPr>
+          <w:rFonts w:eastAsia="Times New Roman" w:cs="Arial"/>
+          <w:spacing w:val="0"/>
+          <w:szCs w:val="20"/>
           <w:lang w:val="de-DE" w:eastAsia="de-DE" w:bidi="ar-SA"/>
         </w:rPr>
-      </w:pPr>
-      <w:r>
-        <w:rPr>
-          <w:rFonts w:eastAsia="Times New Roman" w:cs="Arial"/>
-          <w:spacing w:val="0"/>
-          <w:szCs w:val="20"/>
-          <w:lang w:val="en-AU" w:eastAsia="de-DE" w:bidi="ar-SA"/>
-        </w:rPr>
-        <w:sym w:font="Wingdings" w:char="F0E0"/>
+        <w:t xml:space="preserve"> </w:t>
       </w:r>
       <w:r>
         <w:rPr>
@@ -569,15 +870,6 @@
           <w:szCs w:val="20"/>
           <w:lang w:val="de-DE" w:eastAsia="de-DE" w:bidi="ar-SA"/>
         </w:rPr>
-        <w:t xml:space="preserve"> </w:t>
-      </w:r>
-      <w:r>
-        <w:rPr>
-          <w:rFonts w:eastAsia="Times New Roman" w:cs="Arial"/>
-          <w:spacing w:val="0"/>
-          <w:szCs w:val="20"/>
-          <w:lang w:val="de-DE" w:eastAsia="de-DE" w:bidi="ar-SA"/>
-        </w:rPr>
         <w:t xml:space="preserve">Sicher leicht zu beantworten, auch im Text ändern. </w:t>
       </w:r>
       <w:r>
@@ -585,18 +877,9 @@
           <w:rFonts w:eastAsia="Times New Roman" w:cs="Arial"/>
           <w:spacing w:val="0"/>
           <w:szCs w:val="20"/>
-          <w:lang w:val="de-DE" w:eastAsia="de-DE" w:bidi="ar-SA"/>
-        </w:rPr>
-        <w:t>(C, C</w:t>
-      </w:r>
-      <w:r>
-        <w:rPr>
-          <w:rFonts w:eastAsia="Times New Roman" w:cs="Arial"/>
-          <w:spacing w:val="0"/>
-          <w:szCs w:val="20"/>
-          <w:lang w:val="de-DE" w:eastAsia="de-DE" w:bidi="ar-SA"/>
-        </w:rPr>
-        <w:t>)</w:t>
+          <w:lang w:val="en-AU" w:eastAsia="de-DE" w:bidi="ar-SA"/>
+        </w:rPr>
+        <w:t>(C, C)</w:t>
       </w:r>
     </w:p>
     <w:p>
@@ -611,7 +894,7 @@
           <w:color w:val="4472C4" w:themeColor="accent5"/>
           <w:spacing w:val="0"/>
           <w:szCs w:val="20"/>
-          <w:lang w:val="de-DE" w:eastAsia="de-DE" w:bidi="ar-SA"/>
+          <w:lang w:val="en-AU" w:eastAsia="de-DE" w:bidi="ar-SA"/>
         </w:rPr>
       </w:pPr>
     </w:p>
@@ -650,10 +933,9 @@
         <w:contextualSpacing w:val="0"/>
         <w:rPr>
           <w:rFonts w:eastAsia="Times New Roman" w:cs="Arial"/>
-          <w:color w:val="4472C4" w:themeColor="accent5"/>
-          <w:spacing w:val="0"/>
-          <w:szCs w:val="20"/>
-          <w:lang w:val="de-DE" w:eastAsia="de-DE" w:bidi="ar-SA"/>
+          <w:spacing w:val="0"/>
+          <w:szCs w:val="20"/>
+          <w:lang w:val="en-AU" w:eastAsia="de-DE" w:bidi="ar-SA"/>
         </w:rPr>
       </w:pPr>
       <w:r>
@@ -681,7 +963,80 @@
           <w:szCs w:val="20"/>
           <w:lang w:val="en-AU" w:eastAsia="de-DE" w:bidi="ar-SA"/>
         </w:rPr>
-        <w:t xml:space="preserve">Interconnected: Durch das KF Framework. </w:t>
+        <w:t xml:space="preserve">The underlying philosophy of our approach is to conserve modularity and interpretability as much as possible. </w:t>
+      </w:r>
+      <w:r>
+        <w:rPr>
+          <w:rFonts w:eastAsia="Times New Roman" w:cs="Arial"/>
+          <w:spacing w:val="0"/>
+          <w:szCs w:val="20"/>
+          <w:lang w:val="en-AU" w:eastAsia="de-DE" w:bidi="ar-SA"/>
+        </w:rPr>
+        <w:t>Thus, e</w:t>
+      </w:r>
+      <w:r>
+        <w:rPr>
+          <w:rFonts w:eastAsia="Times New Roman" w:cs="Arial"/>
+          <w:spacing w:val="0"/>
+          <w:szCs w:val="20"/>
+          <w:lang w:val="en-AU" w:eastAsia="de-DE" w:bidi="ar-SA"/>
+        </w:rPr>
+        <w:t xml:space="preserve">ach of the three networks </w:t>
+      </w:r>
+      <w:r>
+        <w:rPr>
+          <w:rFonts w:eastAsia="Times New Roman" w:cs="Arial"/>
+          <w:spacing w:val="0"/>
+          <w:szCs w:val="20"/>
+          <w:lang w:val="en-AU" w:eastAsia="de-DE" w:bidi="ar-SA"/>
+        </w:rPr>
+        <w:t>are</w:t>
+      </w:r>
+      <w:r>
+        <w:rPr>
+          <w:rFonts w:eastAsia="Times New Roman" w:cs="Arial"/>
+          <w:spacing w:val="0"/>
+          <w:szCs w:val="20"/>
+          <w:lang w:val="en-AU" w:eastAsia="de-DE" w:bidi="ar-SA"/>
+        </w:rPr>
+        <w:t xml:space="preserve"> trained independently of the others. </w:t>
+      </w:r>
+      <w:r>
+        <w:rPr>
+          <w:rFonts w:eastAsia="Times New Roman" w:cs="Arial"/>
+          <w:spacing w:val="0"/>
+          <w:szCs w:val="20"/>
+          <w:lang w:val="en-AU" w:eastAsia="de-DE" w:bidi="ar-SA"/>
+        </w:rPr>
+        <w:t xml:space="preserve">This also means that their performance can be assessed independently. </w:t>
+      </w:r>
+      <w:r>
+        <w:rPr>
+          <w:rFonts w:eastAsia="Times New Roman" w:cs="Arial"/>
+          <w:spacing w:val="0"/>
+          <w:szCs w:val="20"/>
+          <w:lang w:val="en-AU" w:eastAsia="de-DE" w:bidi="ar-SA"/>
+        </w:rPr>
+        <w:t xml:space="preserve">The prediction network SPENT is evaluated through the </w:t>
+      </w:r>
+      <w:r>
+        <w:rPr>
+          <w:rFonts w:eastAsia="Times New Roman" w:cs="Arial"/>
+          <w:spacing w:val="0"/>
+          <w:szCs w:val="20"/>
+          <w:lang w:val="en-AU" w:eastAsia="de-DE" w:bidi="ar-SA"/>
+        </w:rPr>
+        <w:lastRenderedPageBreak/>
+        <w:t xml:space="preserve">Root Mean Square Error </w:t>
+      </w:r>
+      <w:r>
+        <w:rPr>
+          <w:rFonts w:eastAsia="Times New Roman" w:cs="Arial"/>
+          <w:spacing w:val="0"/>
+          <w:szCs w:val="20"/>
+          <w:lang w:val="en-AU" w:eastAsia="de-DE" w:bidi="ar-SA"/>
+        </w:rPr>
+        <w:t xml:space="preserve">of the prediction </w:t>
       </w:r>
       <w:proofErr w:type="spellStart"/>
       <w:r>
@@ -689,9 +1044,9 @@
           <w:rFonts w:eastAsia="Times New Roman" w:cs="Arial"/>
           <w:spacing w:val="0"/>
           <w:szCs w:val="20"/>
-          <w:lang w:val="de-DE" w:eastAsia="de-DE" w:bidi="ar-SA"/>
-        </w:rPr>
-        <w:t>Practical</w:t>
+          <w:lang w:val="en-AU" w:eastAsia="de-DE" w:bidi="ar-SA"/>
+        </w:rPr>
+        <w:t>posisions</w:t>
       </w:r>
       <w:proofErr w:type="spellEnd"/>
       <w:r>
@@ -699,112 +1054,168 @@
           <w:rFonts w:eastAsia="Times New Roman" w:cs="Arial"/>
           <w:spacing w:val="0"/>
           <w:szCs w:val="20"/>
-          <w:lang w:val="de-DE" w:eastAsia="de-DE" w:bidi="ar-SA"/>
+          <w:lang w:val="en-AU" w:eastAsia="de-DE" w:bidi="ar-SA"/>
+        </w:rPr>
+        <w:t xml:space="preserve"> (table I)</w:t>
+      </w:r>
+      <w:r>
+        <w:rPr>
+          <w:rFonts w:eastAsia="Times New Roman" w:cs="Arial"/>
+          <w:spacing w:val="0"/>
+          <w:szCs w:val="20"/>
+          <w:lang w:val="en-AU" w:eastAsia="de-DE" w:bidi="ar-SA"/>
+        </w:rPr>
+        <w:t xml:space="preserve"> and the two </w:t>
+      </w:r>
+      <w:proofErr w:type="spellStart"/>
+      <w:r>
+        <w:rPr>
+          <w:rFonts w:eastAsia="Times New Roman" w:cs="Arial"/>
+          <w:spacing w:val="0"/>
+          <w:szCs w:val="20"/>
+          <w:lang w:val="en-AU" w:eastAsia="de-DE" w:bidi="ar-SA"/>
+        </w:rPr>
+        <w:t>associtation</w:t>
+      </w:r>
+      <w:proofErr w:type="spellEnd"/>
+      <w:r>
+        <w:rPr>
+          <w:rFonts w:eastAsia="Times New Roman" w:cs="Arial"/>
+          <w:spacing w:val="0"/>
+          <w:szCs w:val="20"/>
+          <w:lang w:val="en-AU" w:eastAsia="de-DE" w:bidi="ar-SA"/>
+        </w:rPr>
+        <w:t xml:space="preserve"> networks (S</w:t>
+      </w:r>
+      <w:r>
+        <w:rPr>
+          <w:rFonts w:eastAsia="Times New Roman" w:cs="Arial"/>
+          <w:spacing w:val="0"/>
+          <w:szCs w:val="20"/>
+          <w:lang w:val="en-AU" w:eastAsia="de-DE" w:bidi="ar-SA"/>
+        </w:rPr>
+        <w:t xml:space="preserve">ANT and </w:t>
+      </w:r>
+      <w:proofErr w:type="spellStart"/>
+      <w:r>
+        <w:rPr>
+          <w:rFonts w:eastAsia="Times New Roman" w:cs="Arial"/>
+          <w:spacing w:val="0"/>
+          <w:szCs w:val="20"/>
+          <w:lang w:val="en-AU" w:eastAsia="de-DE" w:bidi="ar-SA"/>
+        </w:rPr>
+        <w:t>MANTa</w:t>
+      </w:r>
+      <w:proofErr w:type="spellEnd"/>
+      <w:r>
+        <w:rPr>
+          <w:rFonts w:eastAsia="Times New Roman" w:cs="Arial"/>
+          <w:spacing w:val="0"/>
+          <w:szCs w:val="20"/>
+          <w:lang w:val="en-AU" w:eastAsia="de-DE" w:bidi="ar-SA"/>
+        </w:rPr>
+        <w:t xml:space="preserve">) are evaluated through their association </w:t>
+      </w:r>
+      <w:proofErr w:type="spellStart"/>
+      <w:r>
+        <w:rPr>
+          <w:rFonts w:eastAsia="Times New Roman" w:cs="Arial"/>
+          <w:spacing w:val="0"/>
+          <w:szCs w:val="20"/>
+          <w:lang w:val="en-AU" w:eastAsia="de-DE" w:bidi="ar-SA"/>
+        </w:rPr>
+        <w:t>accouracy</w:t>
+      </w:r>
+      <w:proofErr w:type="spellEnd"/>
+      <w:r>
+        <w:rPr>
+          <w:rFonts w:eastAsia="Times New Roman" w:cs="Arial"/>
+          <w:spacing w:val="0"/>
+          <w:szCs w:val="20"/>
+          <w:lang w:val="en-AU" w:eastAsia="de-DE" w:bidi="ar-SA"/>
+        </w:rPr>
+        <w:t xml:space="preserve"> (table II).</w:t>
+      </w:r>
+      <w:r>
+        <w:rPr>
+          <w:rFonts w:eastAsia="Times New Roman" w:cs="Arial"/>
+          <w:spacing w:val="0"/>
+          <w:szCs w:val="20"/>
+          <w:lang w:val="en-AU" w:eastAsia="de-DE" w:bidi="ar-SA"/>
         </w:rPr>
         <w:t xml:space="preserve"> </w:t>
       </w:r>
-      <w:proofErr w:type="spellStart"/>
-      <w:r>
-        <w:rPr>
-          <w:rFonts w:eastAsia="Times New Roman" w:cs="Arial"/>
-          <w:spacing w:val="0"/>
-          <w:szCs w:val="20"/>
-          <w:lang w:val="de-DE" w:eastAsia="de-DE" w:bidi="ar-SA"/>
-        </w:rPr>
-        <w:t>application</w:t>
-      </w:r>
-      <w:proofErr w:type="spellEnd"/>
-      <w:r>
-        <w:rPr>
-          <w:rFonts w:eastAsia="Times New Roman" w:cs="Arial"/>
-          <w:spacing w:val="0"/>
-          <w:szCs w:val="20"/>
-          <w:lang w:val="de-DE" w:eastAsia="de-DE" w:bidi="ar-SA"/>
-        </w:rPr>
-        <w:t xml:space="preserve">: </w:t>
-      </w:r>
-      <w:r>
-        <w:rPr>
-          <w:rFonts w:eastAsia="Times New Roman" w:cs="Arial"/>
-          <w:spacing w:val="0"/>
-          <w:szCs w:val="20"/>
-          <w:lang w:val="de-DE" w:eastAsia="de-DE" w:bidi="ar-SA"/>
-        </w:rPr>
-        <w:t>Zusammen testen, einzeln testen um Probleme zu isolieren</w:t>
-      </w:r>
-      <w:r>
-        <w:rPr>
-          <w:rFonts w:eastAsia="Times New Roman" w:cs="Arial"/>
-          <w:spacing w:val="0"/>
-          <w:szCs w:val="20"/>
-          <w:lang w:val="de-DE" w:eastAsia="de-DE" w:bidi="ar-SA"/>
-        </w:rPr>
-        <w:t xml:space="preserve">. Das sollte alles im Paper stehen, </w:t>
-      </w:r>
-      <w:proofErr w:type="spellStart"/>
-      <w:r>
-        <w:rPr>
-          <w:rFonts w:eastAsia="Times New Roman" w:cs="Arial"/>
-          <w:spacing w:val="0"/>
-          <w:szCs w:val="20"/>
-          <w:lang w:val="de-DE" w:eastAsia="de-DE" w:bidi="ar-SA"/>
-        </w:rPr>
-        <w:t>vlt</w:t>
-      </w:r>
-      <w:proofErr w:type="spellEnd"/>
-      <w:r>
-        <w:rPr>
-          <w:rFonts w:eastAsia="Times New Roman" w:cs="Arial"/>
-          <w:spacing w:val="0"/>
-          <w:szCs w:val="20"/>
-          <w:lang w:val="de-DE" w:eastAsia="de-DE" w:bidi="ar-SA"/>
-        </w:rPr>
-        <w:t xml:space="preserve"> kann man </w:t>
-      </w:r>
-      <w:r>
-        <w:rPr>
-          <w:rFonts w:eastAsia="Times New Roman" w:cs="Arial"/>
-          <w:spacing w:val="0"/>
-          <w:szCs w:val="20"/>
-          <w:lang w:val="de-DE" w:eastAsia="de-DE" w:bidi="ar-SA"/>
-        </w:rPr>
-        <w:t xml:space="preserve">hier noch etwas leicht umschreiben oder deutlicher </w:t>
-      </w:r>
-      <w:r>
-        <w:rPr>
-          <w:rFonts w:eastAsia="Times New Roman" w:cs="Arial"/>
-          <w:spacing w:val="0"/>
-          <w:szCs w:val="20"/>
-          <w:lang w:val="de-DE" w:eastAsia="de-DE" w:bidi="ar-SA"/>
-        </w:rPr>
-        <w:t xml:space="preserve">schreiben. </w:t>
-      </w:r>
-      <w:r>
-        <w:rPr>
-          <w:rFonts w:eastAsia="Times New Roman" w:cs="Arial"/>
-          <w:spacing w:val="0"/>
-          <w:szCs w:val="20"/>
-          <w:lang w:val="de-DE" w:eastAsia="de-DE" w:bidi="ar-SA"/>
-        </w:rPr>
-        <w:t>(M</w:t>
-      </w:r>
-      <w:r>
-        <w:rPr>
-          <w:rFonts w:eastAsia="Times New Roman" w:cs="Arial"/>
-          <w:spacing w:val="0"/>
-          <w:szCs w:val="20"/>
-          <w:lang w:val="de-DE" w:eastAsia="de-DE" w:bidi="ar-SA"/>
-        </w:rPr>
-        <w:t>D</w:t>
-      </w:r>
-      <w:r>
-        <w:rPr>
-          <w:rFonts w:eastAsia="Times New Roman" w:cs="Arial"/>
-          <w:spacing w:val="0"/>
-          <w:szCs w:val="20"/>
-          <w:lang w:val="de-DE" w:eastAsia="de-DE" w:bidi="ar-SA"/>
-        </w:rPr>
-        <w:t>)</w:t>
+      <w:r>
+        <w:rPr>
+          <w:rFonts w:eastAsia="Times New Roman" w:cs="Arial"/>
+          <w:spacing w:val="0"/>
+          <w:szCs w:val="20"/>
+          <w:lang w:val="en-AU" w:eastAsia="de-DE" w:bidi="ar-SA"/>
+        </w:rPr>
+        <w:t xml:space="preserve">This induvial testing ensures </w:t>
+      </w:r>
+      <w:r>
+        <w:rPr>
+          <w:rFonts w:eastAsia="Times New Roman" w:cs="Arial"/>
+          <w:spacing w:val="0"/>
+          <w:szCs w:val="20"/>
+          <w:lang w:val="en-AU" w:eastAsia="de-DE" w:bidi="ar-SA"/>
+        </w:rPr>
+        <w:t xml:space="preserve">effectiveness </w:t>
+      </w:r>
+      <w:r>
+        <w:rPr>
+          <w:rFonts w:eastAsia="Times New Roman" w:cs="Arial"/>
+          <w:spacing w:val="0"/>
+          <w:szCs w:val="20"/>
+          <w:lang w:val="en-AU" w:eastAsia="de-DE" w:bidi="ar-SA"/>
+        </w:rPr>
+        <w:t>and</w:t>
+      </w:r>
+      <w:r>
+        <w:rPr>
+          <w:rFonts w:eastAsia="Times New Roman" w:cs="Arial"/>
+          <w:spacing w:val="0"/>
+          <w:szCs w:val="20"/>
+          <w:lang w:val="en-AU" w:eastAsia="de-DE" w:bidi="ar-SA"/>
+        </w:rPr>
+        <w:t xml:space="preserve"> </w:t>
+      </w:r>
+      <w:r>
+        <w:rPr>
+          <w:rFonts w:eastAsia="Times New Roman" w:cs="Arial"/>
+          <w:spacing w:val="0"/>
+          <w:szCs w:val="20"/>
+          <w:lang w:val="en-AU" w:eastAsia="de-DE" w:bidi="ar-SA"/>
+        </w:rPr>
+        <w:t xml:space="preserve">the possibility to localize areas of improvement. Since this is a core development guideline for our work, we underlined it </w:t>
+      </w:r>
+      <w:r>
+        <w:rPr>
+          <w:rFonts w:eastAsia="Times New Roman" w:cs="Arial"/>
+          <w:spacing w:val="0"/>
+          <w:szCs w:val="20"/>
+          <w:lang w:val="en-AU" w:eastAsia="de-DE" w:bidi="ar-SA"/>
+        </w:rPr>
+        <w:t xml:space="preserve">stronger </w:t>
+      </w:r>
+      <w:r>
+        <w:rPr>
+          <w:rFonts w:eastAsia="Times New Roman" w:cs="Arial"/>
+          <w:spacing w:val="0"/>
+          <w:szCs w:val="20"/>
+          <w:lang w:val="en-AU" w:eastAsia="de-DE" w:bidi="ar-SA"/>
+        </w:rPr>
+        <w:t>in our abstract and the conclusion</w:t>
+      </w:r>
+      <w:r>
+        <w:rPr>
+          <w:rFonts w:eastAsia="Times New Roman" w:cs="Arial"/>
+          <w:spacing w:val="0"/>
+          <w:szCs w:val="20"/>
+          <w:lang w:val="en-AU" w:eastAsia="de-DE" w:bidi="ar-SA"/>
+        </w:rPr>
+        <w:t xml:space="preserve">. </w:t>
       </w:r>
     </w:p>
     <w:p>
@@ -819,7 +1230,7 @@
           <w:color w:val="4472C4" w:themeColor="accent5"/>
           <w:spacing w:val="0"/>
           <w:szCs w:val="20"/>
-          <w:lang w:val="de-DE" w:eastAsia="de-DE" w:bidi="ar-SA"/>
+          <w:lang w:val="en-AU" w:eastAsia="de-DE" w:bidi="ar-SA"/>
         </w:rPr>
       </w:pPr>
     </w:p>
@@ -846,7 +1257,6 @@
           <w:szCs w:val="20"/>
           <w:lang w:val="en-AU" w:eastAsia="de-DE" w:bidi="ar-SA"/>
         </w:rPr>
-        <w:lastRenderedPageBreak/>
         <w:t>4. The validation was conducted only on the KITTI dataset, which is often considered limited. Further validation on other datasets should be performed to demonstrate the method's transferability.</w:t>
       </w:r>
     </w:p>
@@ -1022,7 +1432,7 @@
         <w:rPr>
           <w:rFonts w:eastAsia="Times New Roman" w:cs="Arial"/>
           <w:szCs w:val="20"/>
-          <w:lang w:val="de-DE" w:eastAsia="de-DE"/>
+          <w:lang w:val="en-AU" w:eastAsia="de-DE"/>
         </w:rPr>
       </w:pPr>
       <w:r>
@@ -1050,7 +1460,16 @@
           <w:szCs w:val="20"/>
           <w:lang w:val="de-DE" w:eastAsia="de-DE" w:bidi="ar-SA"/>
         </w:rPr>
-        <w:t>rafik bauen. Ich glaube er will einfach Balkendiagramme. (MD)</w:t>
+        <w:t xml:space="preserve">rafik bauen. Ich glaube er will einfach Balkendiagramme. </w:t>
+      </w:r>
+      <w:r>
+        <w:rPr>
+          <w:rFonts w:eastAsia="Times New Roman" w:cs="Arial"/>
+          <w:spacing w:val="0"/>
+          <w:szCs w:val="20"/>
+          <w:lang w:val="en-AU" w:eastAsia="de-DE" w:bidi="ar-SA"/>
+        </w:rPr>
+        <w:t>(MD)</w:t>
       </w:r>
     </w:p>
     <w:p>
@@ -1065,7 +1484,7 @@
           <w:color w:val="4472C4" w:themeColor="accent5"/>
           <w:spacing w:val="0"/>
           <w:szCs w:val="20"/>
-          <w:lang w:val="de-DE" w:eastAsia="de-DE" w:bidi="ar-SA"/>
+          <w:lang w:val="en-AU" w:eastAsia="de-DE" w:bidi="ar-SA"/>
         </w:rPr>
       </w:pPr>
     </w:p>
@@ -1107,7 +1526,7 @@
           <w:color w:val="4472C4" w:themeColor="accent5"/>
           <w:spacing w:val="0"/>
           <w:szCs w:val="20"/>
-          <w:lang w:val="de-DE" w:eastAsia="de-DE" w:bidi="ar-SA"/>
+          <w:lang w:val="en-AU" w:eastAsia="de-DE" w:bidi="ar-SA"/>
         </w:rPr>
       </w:pPr>
       <w:r>
@@ -1124,27 +1543,65 @@
           <w:rFonts w:eastAsia="Times New Roman" w:cs="Arial"/>
           <w:spacing w:val="0"/>
           <w:szCs w:val="20"/>
-          <w:lang w:val="de-DE" w:eastAsia="de-DE" w:bidi="ar-SA"/>
-        </w:rPr>
-        <w:t xml:space="preserve"> Kann ich nochmal </w:t>
-      </w:r>
-      <w:r>
-        <w:rPr>
-          <w:rFonts w:eastAsia="Times New Roman" w:cs="Arial"/>
-          <w:spacing w:val="0"/>
-          <w:szCs w:val="20"/>
-          <w:lang w:val="de-DE" w:eastAsia="de-DE" w:bidi="ar-SA"/>
-        </w:rPr>
-        <w:t>durchgucken</w:t>
-      </w:r>
-      <w:r>
-        <w:rPr>
-          <w:rFonts w:eastAsia="Times New Roman" w:cs="Arial"/>
-          <w:spacing w:val="0"/>
-          <w:szCs w:val="20"/>
-          <w:lang w:val="de-DE" w:eastAsia="de-DE" w:bidi="ar-SA"/>
-        </w:rPr>
-        <w:t xml:space="preserve"> (MD)</w:t>
+          <w:lang w:val="en-AU" w:eastAsia="de-DE" w:bidi="ar-SA"/>
+        </w:rPr>
+        <w:t xml:space="preserve"> </w:t>
+      </w:r>
+      <w:r>
+        <w:rPr>
+          <w:rFonts w:eastAsia="Times New Roman" w:cs="Arial"/>
+          <w:spacing w:val="0"/>
+          <w:szCs w:val="20"/>
+          <w:lang w:val="en-AU" w:eastAsia="de-DE" w:bidi="ar-SA"/>
+        </w:rPr>
+        <w:t xml:space="preserve">This was well </w:t>
+      </w:r>
+      <w:proofErr w:type="spellStart"/>
+      <w:r>
+        <w:rPr>
+          <w:rFonts w:eastAsia="Times New Roman" w:cs="Arial"/>
+          <w:spacing w:val="0"/>
+          <w:szCs w:val="20"/>
+          <w:lang w:val="en-AU" w:eastAsia="de-DE" w:bidi="ar-SA"/>
+        </w:rPr>
+        <w:t>spottet</w:t>
+      </w:r>
+      <w:proofErr w:type="spellEnd"/>
+      <w:r>
+        <w:rPr>
+          <w:rFonts w:eastAsia="Times New Roman" w:cs="Arial"/>
+          <w:spacing w:val="0"/>
+          <w:szCs w:val="20"/>
+          <w:lang w:val="en-AU" w:eastAsia="de-DE" w:bidi="ar-SA"/>
+        </w:rPr>
+        <w:t xml:space="preserve">, all </w:t>
+      </w:r>
+      <w:r>
+        <w:rPr>
+          <w:rFonts w:eastAsia="Times New Roman" w:cs="Arial"/>
+          <w:spacing w:val="0"/>
+          <w:szCs w:val="20"/>
+          <w:lang w:val="en-AU" w:eastAsia="de-DE" w:bidi="ar-SA"/>
+        </w:rPr>
+        <w:t xml:space="preserve">indents after equations were removed. Number of changes: </w:t>
+      </w:r>
+      <w:r>
+        <w:rPr>
+          <w:rFonts w:eastAsia="Times New Roman" w:cs="Arial"/>
+          <w:spacing w:val="0"/>
+          <w:szCs w:val="20"/>
+          <w:lang w:val="en-AU" w:eastAsia="de-DE" w:bidi="ar-SA"/>
+        </w:rPr>
+        <w:t>4</w:t>
+      </w:r>
+      <w:r>
+        <w:rPr>
+          <w:rFonts w:eastAsia="Times New Roman" w:cs="Arial"/>
+          <w:spacing w:val="0"/>
+          <w:szCs w:val="20"/>
+          <w:lang w:val="en-AU" w:eastAsia="de-DE" w:bidi="ar-SA"/>
+        </w:rPr>
+        <w:t xml:space="preserve"> </w:t>
       </w:r>
     </w:p>
     <w:p>
@@ -1159,7 +1616,7 @@
           <w:color w:val="4472C4" w:themeColor="accent5"/>
           <w:spacing w:val="0"/>
           <w:szCs w:val="20"/>
-          <w:lang w:val="de-DE" w:eastAsia="de-DE" w:bidi="ar-SA"/>
+          <w:lang w:val="en-AU" w:eastAsia="de-DE" w:bidi="ar-SA"/>
         </w:rPr>
       </w:pPr>
     </w:p>
@@ -1175,7 +1632,7 @@
           <w:color w:val="4472C4" w:themeColor="accent5"/>
           <w:spacing w:val="0"/>
           <w:szCs w:val="20"/>
-          <w:lang w:val="de-DE" w:eastAsia="de-DE" w:bidi="ar-SA"/>
+          <w:lang w:val="en-AU" w:eastAsia="de-DE" w:bidi="ar-SA"/>
         </w:rPr>
       </w:pPr>
     </w:p>
@@ -1281,17 +1738,26 @@
           <w:color w:val="4472C4" w:themeColor="accent5"/>
           <w:spacing w:val="0"/>
           <w:szCs w:val="20"/>
+          <w:lang w:val="en-AU" w:eastAsia="de-DE" w:bidi="ar-SA"/>
+        </w:rPr>
+      </w:pPr>
+      <w:r>
+        <w:rPr>
+          <w:rFonts w:eastAsia="Times New Roman" w:cs="Arial"/>
+          <w:spacing w:val="0"/>
+          <w:szCs w:val="20"/>
+          <w:lang w:val="en-AU" w:eastAsia="de-DE" w:bidi="ar-SA"/>
+        </w:rPr>
+        <w:sym w:font="Wingdings" w:char="F0E0"/>
+      </w:r>
+      <w:r>
+        <w:rPr>
+          <w:rFonts w:eastAsia="Times New Roman" w:cs="Arial"/>
+          <w:spacing w:val="0"/>
+          <w:szCs w:val="20"/>
           <w:lang w:val="de-DE" w:eastAsia="de-DE" w:bidi="ar-SA"/>
         </w:rPr>
-      </w:pPr>
-      <w:r>
-        <w:rPr>
-          <w:rFonts w:eastAsia="Times New Roman" w:cs="Arial"/>
-          <w:spacing w:val="0"/>
-          <w:szCs w:val="20"/>
-          <w:lang w:val="en-AU" w:eastAsia="de-DE" w:bidi="ar-SA"/>
-        </w:rPr>
-        <w:sym w:font="Wingdings" w:char="F0E0"/>
+        <w:t xml:space="preserve"> Interfaces in den Anhang? </w:t>
       </w:r>
       <w:r>
         <w:rPr>
@@ -1300,8 +1766,9 @@
           <w:szCs w:val="20"/>
           <w:lang w:val="de-DE" w:eastAsia="de-DE" w:bidi="ar-SA"/>
         </w:rPr>
-        <w:t xml:space="preserve"> Interfaces in den Anhang? </w:t>
-      </w:r>
+        <w:t xml:space="preserve">Wir haben ja schon drin stehen was In und Output ist, aber das kann man schon noch zusammenfassen in </w:t>
+      </w:r>
+      <w:proofErr w:type="spellStart"/>
       <w:r>
         <w:rPr>
           <w:rFonts w:eastAsia="Times New Roman" w:cs="Arial"/>
@@ -1309,7 +1776,17 @@
           <w:szCs w:val="20"/>
           <w:lang w:val="de-DE" w:eastAsia="de-DE" w:bidi="ar-SA"/>
         </w:rPr>
-        <w:t xml:space="preserve">Wir haben ja schon drin stehen was In und Output ist, aber das kann man schon noch zusammenfassen in </w:t>
+        <w:t>struct</w:t>
+      </w:r>
+      <w:proofErr w:type="spellEnd"/>
+      <w:r>
+        <w:rPr>
+          <w:rFonts w:eastAsia="Times New Roman" w:cs="Arial"/>
+          <w:spacing w:val="0"/>
+          <w:szCs w:val="20"/>
+          <w:lang w:val="de-DE" w:eastAsia="de-DE" w:bidi="ar-SA"/>
+        </w:rPr>
+        <w:t xml:space="preserve"> </w:t>
       </w:r>
       <w:proofErr w:type="spellStart"/>
       <w:r>
@@ -1319,7 +1796,7 @@
           <w:szCs w:val="20"/>
           <w:lang w:val="de-DE" w:eastAsia="de-DE" w:bidi="ar-SA"/>
         </w:rPr>
-        <w:t>struct</w:t>
+        <w:t>schreibweise</w:t>
       </w:r>
       <w:proofErr w:type="spellEnd"/>
       <w:r>
@@ -1329,26 +1806,6 @@
           <w:szCs w:val="20"/>
           <w:lang w:val="de-DE" w:eastAsia="de-DE" w:bidi="ar-SA"/>
         </w:rPr>
-        <w:t xml:space="preserve"> </w:t>
-      </w:r>
-      <w:proofErr w:type="spellStart"/>
-      <w:r>
-        <w:rPr>
-          <w:rFonts w:eastAsia="Times New Roman" w:cs="Arial"/>
-          <w:spacing w:val="0"/>
-          <w:szCs w:val="20"/>
-          <w:lang w:val="de-DE" w:eastAsia="de-DE" w:bidi="ar-SA"/>
-        </w:rPr>
-        <w:t>schreibweise</w:t>
-      </w:r>
-      <w:proofErr w:type="spellEnd"/>
-      <w:r>
-        <w:rPr>
-          <w:rFonts w:eastAsia="Times New Roman" w:cs="Arial"/>
-          <w:spacing w:val="0"/>
-          <w:szCs w:val="20"/>
-          <w:lang w:val="de-DE" w:eastAsia="de-DE" w:bidi="ar-SA"/>
-        </w:rPr>
         <w:t xml:space="preserve">. </w:t>
       </w:r>
       <w:r>
@@ -1356,25 +1813,16 @@
           <w:rFonts w:eastAsia="Times New Roman" w:cs="Arial"/>
           <w:spacing w:val="0"/>
           <w:szCs w:val="20"/>
-          <w:lang w:val="de-DE" w:eastAsia="de-DE" w:bidi="ar-SA"/>
-        </w:rPr>
-        <w:t>(C</w:t>
-      </w:r>
-      <w:r>
-        <w:rPr>
-          <w:rFonts w:eastAsia="Times New Roman" w:cs="Arial"/>
-          <w:spacing w:val="0"/>
-          <w:szCs w:val="20"/>
-          <w:lang w:val="de-DE" w:eastAsia="de-DE" w:bidi="ar-SA"/>
-        </w:rPr>
-        <w:t>, C)</w:t>
-      </w:r>
-      <w:r>
-        <w:rPr>
-          <w:rFonts w:eastAsia="Times New Roman" w:cs="Arial"/>
-          <w:spacing w:val="0"/>
-          <w:szCs w:val="20"/>
-          <w:lang w:val="de-DE" w:eastAsia="de-DE" w:bidi="ar-SA"/>
+          <w:lang w:val="en-AU" w:eastAsia="de-DE" w:bidi="ar-SA"/>
+        </w:rPr>
+        <w:t>(C, C)</w:t>
+      </w:r>
+      <w:r>
+        <w:rPr>
+          <w:rFonts w:eastAsia="Times New Roman" w:cs="Arial"/>
+          <w:spacing w:val="0"/>
+          <w:szCs w:val="20"/>
+          <w:lang w:val="en-AU" w:eastAsia="de-DE" w:bidi="ar-SA"/>
         </w:rPr>
         <w:t xml:space="preserve"> </w:t>
       </w:r>
@@ -1391,7 +1839,7 @@
           <w:color w:val="4472C4" w:themeColor="accent5"/>
           <w:spacing w:val="0"/>
           <w:szCs w:val="20"/>
-          <w:lang w:val="de-DE" w:eastAsia="de-DE" w:bidi="ar-SA"/>
+          <w:lang w:val="en-AU" w:eastAsia="de-DE" w:bidi="ar-SA"/>
         </w:rPr>
       </w:pPr>
     </w:p>
@@ -1433,17 +1881,26 @@
           <w:color w:val="4472C4" w:themeColor="accent5"/>
           <w:spacing w:val="0"/>
           <w:szCs w:val="20"/>
+          <w:lang w:val="en-AU" w:eastAsia="de-DE" w:bidi="ar-SA"/>
+        </w:rPr>
+      </w:pPr>
+      <w:r>
+        <w:rPr>
+          <w:rFonts w:eastAsia="Times New Roman" w:cs="Arial"/>
+          <w:spacing w:val="0"/>
+          <w:szCs w:val="20"/>
+          <w:lang w:val="en-AU" w:eastAsia="de-DE" w:bidi="ar-SA"/>
+        </w:rPr>
+        <w:sym w:font="Wingdings" w:char="F0E0"/>
+      </w:r>
+      <w:r>
+        <w:rPr>
+          <w:rFonts w:eastAsia="Times New Roman" w:cs="Arial"/>
+          <w:spacing w:val="0"/>
+          <w:szCs w:val="20"/>
           <w:lang w:val="de-DE" w:eastAsia="de-DE" w:bidi="ar-SA"/>
         </w:rPr>
-      </w:pPr>
-      <w:r>
-        <w:rPr>
-          <w:rFonts w:eastAsia="Times New Roman" w:cs="Arial"/>
-          <w:spacing w:val="0"/>
-          <w:szCs w:val="20"/>
-          <w:lang w:val="en-AU" w:eastAsia="de-DE" w:bidi="ar-SA"/>
-        </w:rPr>
-        <w:sym w:font="Wingdings" w:char="F0E0"/>
+        <w:t xml:space="preserve"> Das könnten wir mit e</w:t>
       </w:r>
       <w:r>
         <w:rPr>
@@ -1452,8 +1909,9 @@
           <w:szCs w:val="20"/>
           <w:lang w:val="de-DE" w:eastAsia="de-DE" w:bidi="ar-SA"/>
         </w:rPr>
-        <w:t xml:space="preserve"> Das könnten wir mit e</w:t>
-      </w:r>
+        <w:t xml:space="preserve">inem zweiten Datensatz beantworten. Und schwach beantworten, indem wir die Noise </w:t>
+      </w:r>
+      <w:proofErr w:type="spellStart"/>
       <w:r>
         <w:rPr>
           <w:rFonts w:eastAsia="Times New Roman" w:cs="Arial"/>
@@ -1461,9 +1919,9 @@
           <w:szCs w:val="20"/>
           <w:lang w:val="de-DE" w:eastAsia="de-DE" w:bidi="ar-SA"/>
         </w:rPr>
-        <w:t xml:space="preserve">inem zweiten Datensatz beantworten. Und schwach beantworten, indem wir die Noise </w:t>
-      </w:r>
-      <w:proofErr w:type="spellStart"/>
+        <w:t>Creation</w:t>
+      </w:r>
+      <w:proofErr w:type="spellEnd"/>
       <w:r>
         <w:rPr>
           <w:rFonts w:eastAsia="Times New Roman" w:cs="Arial"/>
@@ -1471,17 +1929,16 @@
           <w:szCs w:val="20"/>
           <w:lang w:val="de-DE" w:eastAsia="de-DE" w:bidi="ar-SA"/>
         </w:rPr>
-        <w:t>Creation</w:t>
-      </w:r>
-      <w:proofErr w:type="spellEnd"/>
-      <w:r>
-        <w:rPr>
-          <w:rFonts w:eastAsia="Times New Roman" w:cs="Arial"/>
-          <w:spacing w:val="0"/>
-          <w:szCs w:val="20"/>
-          <w:lang w:val="de-DE" w:eastAsia="de-DE" w:bidi="ar-SA"/>
-        </w:rPr>
-        <w:t xml:space="preserve"> nochmal zitieren von oben und unsere Änderungen. (C, C)</w:t>
+        <w:t xml:space="preserve"> nochmal zitieren von oben und unsere Änderungen. </w:t>
+      </w:r>
+      <w:r>
+        <w:rPr>
+          <w:rFonts w:eastAsia="Times New Roman" w:cs="Arial"/>
+          <w:spacing w:val="0"/>
+          <w:szCs w:val="20"/>
+          <w:lang w:val="en-AU" w:eastAsia="de-DE" w:bidi="ar-SA"/>
+        </w:rPr>
+        <w:t>(C, C)</w:t>
       </w:r>
     </w:p>
     <w:p>
@@ -1496,7 +1953,7 @@
           <w:color w:val="4472C4" w:themeColor="accent5"/>
           <w:spacing w:val="0"/>
           <w:szCs w:val="20"/>
-          <w:lang w:val="de-DE" w:eastAsia="de-DE" w:bidi="ar-SA"/>
+          <w:lang w:val="en-AU" w:eastAsia="de-DE" w:bidi="ar-SA"/>
         </w:rPr>
       </w:pPr>
     </w:p>
@@ -1648,6 +2105,7 @@
           <w:szCs w:val="20"/>
           <w:lang w:val="en-AU" w:eastAsia="de-DE" w:bidi="ar-SA"/>
         </w:rPr>
+        <w:lastRenderedPageBreak/>
         <w:t xml:space="preserve">4. The SPENT loss sign appears incorrect; padding is described inconsistently; </w:t>
       </w:r>
       <w:proofErr w:type="spellStart"/>
@@ -1924,7 +2382,6 @@
           <w:szCs w:val="20"/>
           <w:lang w:val="en-AU" w:eastAsia="de-DE" w:bidi="ar-SA"/>
         </w:rPr>
-        <w:lastRenderedPageBreak/>
         <w:sym w:font="Wingdings" w:char="F0E0"/>
       </w:r>
       <w:r>
@@ -2000,17 +2457,26 @@
           <w:color w:val="4472C4" w:themeColor="accent5"/>
           <w:spacing w:val="0"/>
           <w:szCs w:val="20"/>
+          <w:lang w:val="en-AU" w:eastAsia="de-DE" w:bidi="ar-SA"/>
+        </w:rPr>
+      </w:pPr>
+      <w:r>
+        <w:rPr>
+          <w:rFonts w:eastAsia="Times New Roman" w:cs="Arial"/>
+          <w:spacing w:val="0"/>
+          <w:szCs w:val="20"/>
+          <w:lang w:val="en-AU" w:eastAsia="de-DE" w:bidi="ar-SA"/>
+        </w:rPr>
+        <w:sym w:font="Wingdings" w:char="F0E0"/>
+      </w:r>
+      <w:r>
+        <w:rPr>
+          <w:rFonts w:eastAsia="Times New Roman" w:cs="Arial"/>
+          <w:spacing w:val="0"/>
+          <w:szCs w:val="20"/>
           <w:lang w:val="de-DE" w:eastAsia="de-DE" w:bidi="ar-SA"/>
         </w:rPr>
-      </w:pPr>
-      <w:r>
-        <w:rPr>
-          <w:rFonts w:eastAsia="Times New Roman" w:cs="Arial"/>
-          <w:spacing w:val="0"/>
-          <w:szCs w:val="20"/>
-          <w:lang w:val="en-AU" w:eastAsia="de-DE" w:bidi="ar-SA"/>
-        </w:rPr>
-        <w:sym w:font="Wingdings" w:char="F0E0"/>
+        <w:t xml:space="preserve"> Laufzeit angeben aller Modelle a</w:t>
       </w:r>
       <w:r>
         <w:rPr>
@@ -2019,16 +2485,16 @@
           <w:szCs w:val="20"/>
           <w:lang w:val="de-DE" w:eastAsia="de-DE" w:bidi="ar-SA"/>
         </w:rPr>
-        <w:t xml:space="preserve"> Laufzeit angeben aller Modelle a</w:t>
-      </w:r>
-      <w:r>
-        <w:rPr>
-          <w:rFonts w:eastAsia="Times New Roman" w:cs="Arial"/>
-          <w:spacing w:val="0"/>
-          <w:szCs w:val="20"/>
-          <w:lang w:val="de-DE" w:eastAsia="de-DE" w:bidi="ar-SA"/>
-        </w:rPr>
-        <w:t>uf exakt definierter Hardware. (C, C)</w:t>
+        <w:t xml:space="preserve">uf exakt definierter Hardware. </w:t>
+      </w:r>
+      <w:r>
+        <w:rPr>
+          <w:rFonts w:eastAsia="Times New Roman" w:cs="Arial"/>
+          <w:spacing w:val="0"/>
+          <w:szCs w:val="20"/>
+          <w:lang w:val="en-AU" w:eastAsia="de-DE" w:bidi="ar-SA"/>
+        </w:rPr>
+        <w:t>(C, C)</w:t>
       </w:r>
     </w:p>
     <w:p>
@@ -2086,18 +2552,47 @@
           <w:rFonts w:eastAsia="Times New Roman" w:cs="Arial"/>
           <w:spacing w:val="0"/>
           <w:szCs w:val="20"/>
+          <w:lang w:val="en-AU" w:eastAsia="de-DE" w:bidi="ar-SA"/>
+        </w:rPr>
+        <w:t xml:space="preserve"> </w:t>
+      </w:r>
+      <w:r>
+        <w:rPr>
+          <w:rFonts w:eastAsia="Times New Roman" w:cs="Arial"/>
+          <w:spacing w:val="0"/>
+          <w:szCs w:val="20"/>
+          <w:lang w:val="en-AU" w:eastAsia="de-DE" w:bidi="ar-SA"/>
+        </w:rPr>
+        <w:t xml:space="preserve">Sehr </w:t>
+      </w:r>
+      <w:proofErr w:type="spellStart"/>
+      <w:r>
+        <w:rPr>
+          <w:rFonts w:eastAsia="Times New Roman" w:cs="Arial"/>
+          <w:spacing w:val="0"/>
+          <w:szCs w:val="20"/>
+          <w:lang w:val="en-AU" w:eastAsia="de-DE" w:bidi="ar-SA"/>
+        </w:rPr>
+        <w:t>schwammig</w:t>
+      </w:r>
+      <w:proofErr w:type="spellEnd"/>
+      <w:r>
+        <w:rPr>
+          <w:rFonts w:eastAsia="Times New Roman" w:cs="Arial"/>
+          <w:spacing w:val="0"/>
+          <w:szCs w:val="20"/>
+          <w:lang w:val="en-AU" w:eastAsia="de-DE" w:bidi="ar-SA"/>
+        </w:rPr>
+        <w:t xml:space="preserve">. </w:t>
+      </w:r>
+      <w:r>
+        <w:rPr>
+          <w:rFonts w:eastAsia="Times New Roman" w:cs="Arial"/>
+          <w:spacing w:val="0"/>
+          <w:szCs w:val="20"/>
           <w:lang w:val="de-DE" w:eastAsia="de-DE" w:bidi="ar-SA"/>
         </w:rPr>
-        <w:t xml:space="preserve"> </w:t>
-      </w:r>
-      <w:r>
-        <w:rPr>
-          <w:rFonts w:eastAsia="Times New Roman" w:cs="Arial"/>
-          <w:spacing w:val="0"/>
-          <w:szCs w:val="20"/>
-          <w:lang w:val="de-DE" w:eastAsia="de-DE" w:bidi="ar-SA"/>
-        </w:rPr>
-        <w:t>Sehr schwammig. Hier sollten wi</w:t>
+        <w:t>Hier sollten wi</w:t>
       </w:r>
       <w:r>
         <w:rPr>
@@ -3007,19 +3502,27 @@
       <w:framePr w:h="3056" w:hRule="exact" w:hSpace="181" w:wrap="around" w:y="12367"/>
       <w:shd w:val="solid" w:color="FFFFFF" w:fill="FFFFFF"/>
       <w:jc w:val="left"/>
+      <w:rPr>
+        <w:lang w:val="es-ES"/>
+      </w:rPr>
     </w:pPr>
     <w:r>
+      <w:rPr>
+        <w:lang w:val="es-ES"/>
+      </w:rPr>
       <w:t xml:space="preserve">Florianstraße </w:t>
     </w:r>
     <w:r>
       <w:rPr>
         <w:rFonts w:cs="Arial"/>
+        <w:lang w:val="es-ES"/>
       </w:rPr>
       <w:t>15</w:t>
     </w:r>
     <w:r>
       <w:rPr>
         <w:rFonts w:cs="Arial"/>
+        <w:lang w:val="es-ES"/>
       </w:rPr>
       <w:br/>
       <w:t>72160 Horb</w:t>
@@ -3029,6 +3532,9 @@
     <w:pPr>
       <w:pStyle w:val="03BHBWPlatzhalter"/>
       <w:framePr w:h="3056" w:hRule="exact" w:hSpace="181" w:wrap="around" w:y="12367"/>
+      <w:rPr>
+        <w:lang w:val="es-ES"/>
+      </w:rPr>
     </w:pPr>
   </w:p>
   <w:p>
@@ -3037,57 +3543,58 @@
       <w:framePr w:h="3056" w:hRule="exact" w:hSpace="181" w:wrap="around" w:y="12367"/>
       <w:shd w:val="solid" w:color="FFFFFF" w:fill="FFFFFF"/>
       <w:rPr>
-        <w:lang w:val="de-DE"/>
+        <w:lang w:val="es-ES"/>
       </w:rPr>
     </w:pPr>
     <w:r>
+      <w:rPr>
+        <w:lang w:val="es-ES"/>
+      </w:rPr>
       <w:t>Telefon + 49</w:t>
     </w:r>
     <w:r>
       <w:rPr>
         <w:spacing w:val="-20"/>
+        <w:lang w:val="es-ES"/>
       </w:rPr>
       <w:t xml:space="preserve"> .</w:t>
     </w:r>
     <w:r>
+      <w:rPr>
+        <w:lang w:val="es-ES"/>
+      </w:rPr>
+      <w:t xml:space="preserve"> 74 51</w:t>
+    </w:r>
+    <w:r>
+      <w:rPr>
+        <w:spacing w:val="-20"/>
+        <w:lang w:val="es-ES"/>
+      </w:rPr>
+      <w:t xml:space="preserve"> .</w:t>
+    </w:r>
+    <w:r>
+      <w:rPr>
+        <w:lang w:val="es-ES"/>
+      </w:rPr>
+      <w:t xml:space="preserve"> 521</w:t>
+    </w:r>
+    <w:r>
+      <w:rPr>
+        <w:spacing w:val="-20"/>
+        <w:lang w:val="es-ES"/>
+      </w:rPr>
+      <w:t xml:space="preserve"> -</w:t>
+    </w:r>
+    <w:r>
+      <w:rPr>
+        <w:spacing w:val="-2"/>
+        <w:lang w:val="es-ES"/>
+      </w:rPr>
       <w:t xml:space="preserve"> </w:t>
     </w:r>
     <w:r>
       <w:rPr>
-        <w:lang w:val="de-DE"/>
-      </w:rPr>
-      <w:t>74 51</w:t>
-    </w:r>
-    <w:r>
-      <w:rPr>
-        <w:spacing w:val="-20"/>
-        <w:lang w:val="de-DE"/>
-      </w:rPr>
-      <w:t xml:space="preserve"> .</w:t>
-    </w:r>
-    <w:r>
-      <w:rPr>
-        <w:lang w:val="de-DE"/>
-      </w:rPr>
-      <w:t xml:space="preserve"> 521</w:t>
-    </w:r>
-    <w:r>
-      <w:rPr>
-        <w:spacing w:val="-20"/>
-        <w:lang w:val="de-DE"/>
-      </w:rPr>
-      <w:t xml:space="preserve"> -</w:t>
-    </w:r>
-    <w:r>
-      <w:rPr>
-        <w:spacing w:val="-2"/>
-        <w:lang w:val="de-DE"/>
-      </w:rPr>
-      <w:t xml:space="preserve"> </w:t>
-    </w:r>
-    <w:r>
-      <w:rPr>
-        <w:lang w:val="de-DE"/>
+        <w:lang w:val="es-ES"/>
       </w:rPr>
       <w:t>0</w:t>
     </w:r>
@@ -3098,58 +3605,58 @@
       <w:framePr w:h="3056" w:hRule="exact" w:hSpace="181" w:wrap="around" w:y="12367"/>
       <w:shd w:val="solid" w:color="FFFFFF" w:fill="FFFFFF"/>
       <w:rPr>
-        <w:lang w:val="en-US"/>
+        <w:lang w:val="es-ES"/>
       </w:rPr>
     </w:pPr>
     <w:r>
       <w:rPr>
-        <w:lang w:val="en-US"/>
+        <w:lang w:val="es-ES"/>
       </w:rPr>
       <w:t>Telefax + 49</w:t>
     </w:r>
     <w:r>
       <w:rPr>
         <w:spacing w:val="-20"/>
-        <w:lang w:val="en-US"/>
+        <w:lang w:val="es-ES"/>
       </w:rPr>
       <w:t xml:space="preserve"> .</w:t>
     </w:r>
     <w:r>
       <w:rPr>
-        <w:lang w:val="en-US"/>
+        <w:lang w:val="es-ES"/>
       </w:rPr>
       <w:t xml:space="preserve"> 74 51</w:t>
     </w:r>
     <w:r>
       <w:rPr>
         <w:spacing w:val="-20"/>
-        <w:lang w:val="en-US"/>
+        <w:lang w:val="es-ES"/>
       </w:rPr>
       <w:t xml:space="preserve"> .</w:t>
     </w:r>
     <w:r>
       <w:rPr>
-        <w:lang w:val="en-US"/>
+        <w:lang w:val="es-ES"/>
       </w:rPr>
       <w:t xml:space="preserve"> 521</w:t>
     </w:r>
     <w:r>
       <w:rPr>
         <w:spacing w:val="-20"/>
-        <w:lang w:val="en-US"/>
+        <w:lang w:val="es-ES"/>
       </w:rPr>
       <w:t xml:space="preserve"> -</w:t>
     </w:r>
     <w:r>
       <w:rPr>
         <w:spacing w:val="-2"/>
-        <w:lang w:val="en-US"/>
+        <w:lang w:val="es-ES"/>
       </w:rPr>
       <w:t xml:space="preserve"> </w:t>
     </w:r>
     <w:r>
       <w:rPr>
-        <w:lang w:val="en-US"/>
+        <w:lang w:val="es-ES"/>
       </w:rPr>
       <w:t>111</w:t>
     </w:r>
@@ -3159,7 +3666,7 @@
       <w:pStyle w:val="03BHBWPlatzhalter"/>
       <w:framePr w:h="3056" w:hRule="exact" w:hSpace="181" w:wrap="around" w:y="12367"/>
       <w:rPr>
-        <w:lang w:val="en-US"/>
+        <w:lang w:val="es-ES"/>
       </w:rPr>
     </w:pPr>
   </w:p>
@@ -3169,12 +3676,12 @@
       <w:framePr w:h="3056" w:hRule="exact" w:hSpace="181" w:wrap="around" w:y="12367"/>
       <w:shd w:val="solid" w:color="FFFFFF" w:fill="FFFFFF"/>
       <w:rPr>
-        <w:lang w:val="en-US"/>
+        <w:lang w:val="es-ES"/>
       </w:rPr>
     </w:pPr>
     <w:r>
       <w:rPr>
-        <w:lang w:val="en-US"/>
+        <w:lang w:val="es-ES"/>
       </w:rPr>
       <w:t>www.dhbw-stuttgart.de</w:t>
     </w:r>
@@ -5251,6 +5758,7 @@
   <w:style w:type="character" w:default="1" w:styleId="Absatz-Standardschriftart">
     <w:name w:val="Default Paragraph Font"/>
     <w:uiPriority w:val="1"/>
+    <w:semiHidden/>
     <w:unhideWhenUsed/>
   </w:style>
   <w:style w:type="table" w:default="1" w:styleId="NormaleTabelle">

</xml_diff>

<commit_message>
fixed spelling and grammar. added new figure.
</commit_message>
<xml_diff>
--- a/submission_to_autonomous_intelligent_systems/re_submission/response.docx
+++ b/submission_to_autonomous_intelligent_systems/re_submission/response.docx
@@ -1449,27 +1449,36 @@
           <w:rFonts w:eastAsia="Times New Roman" w:cs="Arial"/>
           <w:spacing w:val="0"/>
           <w:szCs w:val="20"/>
-          <w:lang w:val="de-DE" w:eastAsia="de-DE" w:bidi="ar-SA"/>
-        </w:rPr>
-        <w:t xml:space="preserve"> Hier kann ich eine G</w:t>
-      </w:r>
-      <w:r>
-        <w:rPr>
-          <w:rFonts w:eastAsia="Times New Roman" w:cs="Arial"/>
-          <w:spacing w:val="0"/>
-          <w:szCs w:val="20"/>
-          <w:lang w:val="de-DE" w:eastAsia="de-DE" w:bidi="ar-SA"/>
-        </w:rPr>
-        <w:t xml:space="preserve">rafik bauen. Ich glaube er will einfach Balkendiagramme. </w:t>
-      </w:r>
-      <w:r>
-        <w:rPr>
-          <w:rFonts w:eastAsia="Times New Roman" w:cs="Arial"/>
-          <w:spacing w:val="0"/>
-          <w:szCs w:val="20"/>
-          <w:lang w:val="en-AU" w:eastAsia="de-DE" w:bidi="ar-SA"/>
-        </w:rPr>
-        <w:t>(MD)</w:t>
+          <w:lang w:val="en-AU" w:eastAsia="de-DE" w:bidi="ar-SA"/>
+        </w:rPr>
+        <w:t xml:space="preserve"> </w:t>
+      </w:r>
+      <w:r>
+        <w:rPr>
+          <w:rFonts w:eastAsia="Times New Roman" w:cs="Arial"/>
+          <w:spacing w:val="0"/>
+          <w:szCs w:val="20"/>
+          <w:lang w:val="en-AU" w:eastAsia="de-DE" w:bidi="ar-SA"/>
+        </w:rPr>
+        <w:t>Table I is replaced w</w:t>
+      </w:r>
+      <w:r>
+        <w:rPr>
+          <w:rFonts w:eastAsia="Times New Roman" w:cs="Arial"/>
+          <w:spacing w:val="0"/>
+          <w:szCs w:val="20"/>
+          <w:lang w:val="en-AU" w:eastAsia="de-DE" w:bidi="ar-SA"/>
+        </w:rPr>
+        <w:t>ith a graphic representation of the results</w:t>
+      </w:r>
+      <w:r>
+        <w:rPr>
+          <w:rFonts w:eastAsia="Times New Roman" w:cs="Arial"/>
+          <w:spacing w:val="0"/>
+          <w:szCs w:val="20"/>
+          <w:lang w:val="en-AU" w:eastAsia="de-DE" w:bidi="ar-SA"/>
+        </w:rPr>
+        <w:t xml:space="preserve">. </w:t>
       </w:r>
     </w:p>
     <w:p>
@@ -1554,45 +1563,25 @@
           <w:szCs w:val="20"/>
           <w:lang w:val="en-AU" w:eastAsia="de-DE" w:bidi="ar-SA"/>
         </w:rPr>
-        <w:t xml:space="preserve">This was well </w:t>
-      </w:r>
-      <w:proofErr w:type="spellStart"/>
-      <w:r>
-        <w:rPr>
-          <w:rFonts w:eastAsia="Times New Roman" w:cs="Arial"/>
-          <w:spacing w:val="0"/>
-          <w:szCs w:val="20"/>
-          <w:lang w:val="en-AU" w:eastAsia="de-DE" w:bidi="ar-SA"/>
-        </w:rPr>
-        <w:t>spottet</w:t>
-      </w:r>
-      <w:proofErr w:type="spellEnd"/>
-      <w:r>
-        <w:rPr>
-          <w:rFonts w:eastAsia="Times New Roman" w:cs="Arial"/>
-          <w:spacing w:val="0"/>
-          <w:szCs w:val="20"/>
-          <w:lang w:val="en-AU" w:eastAsia="de-DE" w:bidi="ar-SA"/>
-        </w:rPr>
-        <w:t xml:space="preserve">, all </w:t>
-      </w:r>
-      <w:r>
-        <w:rPr>
-          <w:rFonts w:eastAsia="Times New Roman" w:cs="Arial"/>
-          <w:spacing w:val="0"/>
-          <w:szCs w:val="20"/>
-          <w:lang w:val="en-AU" w:eastAsia="de-DE" w:bidi="ar-SA"/>
-        </w:rPr>
-        <w:t xml:space="preserve">indents after equations were removed. Number of changes: </w:t>
-      </w:r>
-      <w:r>
-        <w:rPr>
-          <w:rFonts w:eastAsia="Times New Roman" w:cs="Arial"/>
-          <w:spacing w:val="0"/>
-          <w:szCs w:val="20"/>
-          <w:lang w:val="en-AU" w:eastAsia="de-DE" w:bidi="ar-SA"/>
-        </w:rPr>
-        <w:t>4</w:t>
+        <w:t>This was well spotte</w:t>
+      </w:r>
+      <w:r>
+        <w:rPr>
+          <w:rFonts w:eastAsia="Times New Roman" w:cs="Arial"/>
+          <w:spacing w:val="0"/>
+          <w:szCs w:val="20"/>
+          <w:lang w:val="en-AU" w:eastAsia="de-DE" w:bidi="ar-SA"/>
+        </w:rPr>
+        <w:t>d</w:t>
+      </w:r>
+      <w:r>
+        <w:rPr>
+          <w:rFonts w:eastAsia="Times New Roman" w:cs="Arial"/>
+          <w:spacing w:val="0"/>
+          <w:szCs w:val="20"/>
+          <w:lang w:val="en-AU" w:eastAsia="de-DE" w:bidi="ar-SA"/>
+        </w:rPr>
+        <w:t>.</w:t>
       </w:r>
       <w:r>
         <w:rPr>
@@ -1602,6 +1591,60 @@
           <w:lang w:val="en-AU" w:eastAsia="de-DE" w:bidi="ar-SA"/>
         </w:rPr>
         <w:t xml:space="preserve"> </w:t>
+      </w:r>
+      <w:r>
+        <w:rPr>
+          <w:rFonts w:eastAsia="Times New Roman" w:cs="Arial"/>
+          <w:spacing w:val="0"/>
+          <w:szCs w:val="20"/>
+          <w:lang w:val="en-AU" w:eastAsia="de-DE" w:bidi="ar-SA"/>
+        </w:rPr>
+        <w:t>A</w:t>
+      </w:r>
+      <w:r>
+        <w:rPr>
+          <w:rFonts w:eastAsia="Times New Roman" w:cs="Arial"/>
+          <w:spacing w:val="0"/>
+          <w:szCs w:val="20"/>
+          <w:lang w:val="en-AU" w:eastAsia="de-DE" w:bidi="ar-SA"/>
+        </w:rPr>
+        <w:t xml:space="preserve">ll </w:t>
+      </w:r>
+      <w:r>
+        <w:rPr>
+          <w:rFonts w:eastAsia="Times New Roman" w:cs="Arial"/>
+          <w:spacing w:val="0"/>
+          <w:szCs w:val="20"/>
+          <w:lang w:val="en-AU" w:eastAsia="de-DE" w:bidi="ar-SA"/>
+        </w:rPr>
+        <w:t xml:space="preserve">indents after equations were removed. </w:t>
+      </w:r>
+      <w:r>
+        <w:rPr>
+          <w:rFonts w:eastAsia="Times New Roman" w:cs="Arial"/>
+          <w:spacing w:val="0"/>
+          <w:szCs w:val="20"/>
+          <w:lang w:val="en-AU" w:eastAsia="de-DE" w:bidi="ar-SA"/>
+        </w:rPr>
+        <w:t>We also carefully checked the manuscript for grammatical and spelling error</w:t>
+      </w:r>
+      <w:r>
+        <w:rPr>
+          <w:rFonts w:eastAsia="Times New Roman" w:cs="Arial"/>
+          <w:spacing w:val="0"/>
+          <w:szCs w:val="20"/>
+          <w:lang w:val="en-AU" w:eastAsia="de-DE" w:bidi="ar-SA"/>
+        </w:rPr>
+        <w:t xml:space="preserve"> and made 31 changes</w:t>
+      </w:r>
+      <w:r>
+        <w:rPr>
+          <w:rFonts w:eastAsia="Times New Roman" w:cs="Arial"/>
+          <w:spacing w:val="0"/>
+          <w:szCs w:val="20"/>
+          <w:lang w:val="en-AU" w:eastAsia="de-DE" w:bidi="ar-SA"/>
+        </w:rPr>
+        <w:t>.</w:t>
       </w:r>
     </w:p>
     <w:p>

</xml_diff>

<commit_message>
created fig 8 instead of table II
</commit_message>
<xml_diff>
--- a/submission_to_autonomous_intelligent_systems/re_submission/response.docx
+++ b/submission_to_autonomous_intelligent_systems/re_submission/response.docx
@@ -1017,7 +1017,81 @@
           <w:szCs w:val="20"/>
           <w:lang w:val="en-AU" w:eastAsia="de-DE" w:bidi="ar-SA"/>
         </w:rPr>
-        <w:t xml:space="preserve">The prediction network SPENT is evaluated through the </w:t>
+        <w:t xml:space="preserve">The prediction network SPENT is evaluated through the Root Mean Square Error </w:t>
+      </w:r>
+      <w:r>
+        <w:rPr>
+          <w:rFonts w:eastAsia="Times New Roman" w:cs="Arial"/>
+          <w:spacing w:val="0"/>
+          <w:szCs w:val="20"/>
+          <w:lang w:val="en-AU" w:eastAsia="de-DE" w:bidi="ar-SA"/>
+        </w:rPr>
+        <w:t xml:space="preserve">of the prediction </w:t>
+      </w:r>
+      <w:proofErr w:type="spellStart"/>
+      <w:r>
+        <w:rPr>
+          <w:rFonts w:eastAsia="Times New Roman" w:cs="Arial"/>
+          <w:spacing w:val="0"/>
+          <w:szCs w:val="20"/>
+          <w:lang w:val="en-AU" w:eastAsia="de-DE" w:bidi="ar-SA"/>
+        </w:rPr>
+        <w:t>posisions</w:t>
+      </w:r>
+      <w:proofErr w:type="spellEnd"/>
+      <w:r>
+        <w:rPr>
+          <w:rFonts w:eastAsia="Times New Roman" w:cs="Arial"/>
+          <w:spacing w:val="0"/>
+          <w:szCs w:val="20"/>
+          <w:lang w:val="en-AU" w:eastAsia="de-DE" w:bidi="ar-SA"/>
+        </w:rPr>
+        <w:t xml:space="preserve"> (</w:t>
+      </w:r>
+      <w:r>
+        <w:rPr>
+          <w:rFonts w:eastAsia="Times New Roman" w:cs="Arial"/>
+          <w:spacing w:val="0"/>
+          <w:szCs w:val="20"/>
+          <w:lang w:val="en-AU" w:eastAsia="de-DE" w:bidi="ar-SA"/>
+        </w:rPr>
+        <w:t>old T</w:t>
+      </w:r>
+      <w:r>
+        <w:rPr>
+          <w:rFonts w:eastAsia="Times New Roman" w:cs="Arial"/>
+          <w:spacing w:val="0"/>
+          <w:szCs w:val="20"/>
+          <w:lang w:val="en-AU" w:eastAsia="de-DE" w:bidi="ar-SA"/>
+        </w:rPr>
+        <w:t>able I</w:t>
+      </w:r>
+      <w:r>
+        <w:rPr>
+          <w:rFonts w:eastAsia="Times New Roman" w:cs="Arial"/>
+          <w:spacing w:val="0"/>
+          <w:szCs w:val="20"/>
+          <w:lang w:val="en-AU" w:eastAsia="de-DE" w:bidi="ar-SA"/>
+        </w:rPr>
+        <w:t>, now Fig. 7</w:t>
+      </w:r>
+      <w:r>
+        <w:rPr>
+          <w:rFonts w:eastAsia="Times New Roman" w:cs="Arial"/>
+          <w:spacing w:val="0"/>
+          <w:szCs w:val="20"/>
+          <w:lang w:val="en-AU" w:eastAsia="de-DE" w:bidi="ar-SA"/>
+        </w:rPr>
+        <w:t>)</w:t>
+      </w:r>
+      <w:r>
+        <w:rPr>
+          <w:rFonts w:eastAsia="Times New Roman" w:cs="Arial"/>
+          <w:spacing w:val="0"/>
+          <w:szCs w:val="20"/>
+          <w:lang w:val="en-AU" w:eastAsia="de-DE" w:bidi="ar-SA"/>
+        </w:rPr>
+        <w:t xml:space="preserve"> and </w:t>
       </w:r>
       <w:r>
         <w:rPr>
@@ -1027,16 +1101,7 @@
           <w:lang w:val="en-AU" w:eastAsia="de-DE" w:bidi="ar-SA"/>
         </w:rPr>
         <w:lastRenderedPageBreak/>
-        <w:t xml:space="preserve">Root Mean Square Error </w:t>
-      </w:r>
-      <w:r>
-        <w:rPr>
-          <w:rFonts w:eastAsia="Times New Roman" w:cs="Arial"/>
-          <w:spacing w:val="0"/>
-          <w:szCs w:val="20"/>
-          <w:lang w:val="en-AU" w:eastAsia="de-DE" w:bidi="ar-SA"/>
-        </w:rPr>
-        <w:t xml:space="preserve">of the prediction </w:t>
+        <w:t xml:space="preserve">the two </w:t>
       </w:r>
       <w:proofErr w:type="spellStart"/>
       <w:r>
@@ -1046,7 +1111,7 @@
           <w:szCs w:val="20"/>
           <w:lang w:val="en-AU" w:eastAsia="de-DE" w:bidi="ar-SA"/>
         </w:rPr>
-        <w:t>posisions</w:t>
+        <w:t>associtation</w:t>
       </w:r>
       <w:proofErr w:type="spellEnd"/>
       <w:r>
@@ -1056,16 +1121,16 @@
           <w:szCs w:val="20"/>
           <w:lang w:val="en-AU" w:eastAsia="de-DE" w:bidi="ar-SA"/>
         </w:rPr>
-        <w:t xml:space="preserve"> (table I)</w:t>
-      </w:r>
-      <w:r>
-        <w:rPr>
-          <w:rFonts w:eastAsia="Times New Roman" w:cs="Arial"/>
-          <w:spacing w:val="0"/>
-          <w:szCs w:val="20"/>
-          <w:lang w:val="en-AU" w:eastAsia="de-DE" w:bidi="ar-SA"/>
-        </w:rPr>
-        <w:t xml:space="preserve"> and the two </w:t>
+        <w:t xml:space="preserve"> networks (S</w:t>
+      </w:r>
+      <w:r>
+        <w:rPr>
+          <w:rFonts w:eastAsia="Times New Roman" w:cs="Arial"/>
+          <w:spacing w:val="0"/>
+          <w:szCs w:val="20"/>
+          <w:lang w:val="en-AU" w:eastAsia="de-DE" w:bidi="ar-SA"/>
+        </w:rPr>
+        <w:t xml:space="preserve">ANT and </w:t>
       </w:r>
       <w:proofErr w:type="spellStart"/>
       <w:r>
@@ -1075,7 +1140,7 @@
           <w:szCs w:val="20"/>
           <w:lang w:val="en-AU" w:eastAsia="de-DE" w:bidi="ar-SA"/>
         </w:rPr>
-        <w:t>associtation</w:t>
+        <w:t>MANTa</w:t>
       </w:r>
       <w:proofErr w:type="spellEnd"/>
       <w:r>
@@ -1085,16 +1150,7 @@
           <w:szCs w:val="20"/>
           <w:lang w:val="en-AU" w:eastAsia="de-DE" w:bidi="ar-SA"/>
         </w:rPr>
-        <w:t xml:space="preserve"> networks (S</w:t>
-      </w:r>
-      <w:r>
-        <w:rPr>
-          <w:rFonts w:eastAsia="Times New Roman" w:cs="Arial"/>
-          <w:spacing w:val="0"/>
-          <w:szCs w:val="20"/>
-          <w:lang w:val="en-AU" w:eastAsia="de-DE" w:bidi="ar-SA"/>
-        </w:rPr>
-        <w:t xml:space="preserve">ANT and </w:t>
+        <w:t xml:space="preserve">) are evaluated through their association </w:t>
       </w:r>
       <w:proofErr w:type="spellStart"/>
       <w:r>
@@ -1104,7 +1160,7 @@
           <w:szCs w:val="20"/>
           <w:lang w:val="en-AU" w:eastAsia="de-DE" w:bidi="ar-SA"/>
         </w:rPr>
-        <w:t>MANTa</w:t>
+        <w:t>accouracy</w:t>
       </w:r>
       <w:proofErr w:type="spellEnd"/>
       <w:r>
@@ -1114,27 +1170,43 @@
           <w:szCs w:val="20"/>
           <w:lang w:val="en-AU" w:eastAsia="de-DE" w:bidi="ar-SA"/>
         </w:rPr>
-        <w:t xml:space="preserve">) are evaluated through their association </w:t>
-      </w:r>
-      <w:proofErr w:type="spellStart"/>
-      <w:r>
-        <w:rPr>
-          <w:rFonts w:eastAsia="Times New Roman" w:cs="Arial"/>
-          <w:spacing w:val="0"/>
-          <w:szCs w:val="20"/>
-          <w:lang w:val="en-AU" w:eastAsia="de-DE" w:bidi="ar-SA"/>
-        </w:rPr>
-        <w:t>accouracy</w:t>
-      </w:r>
-      <w:proofErr w:type="spellEnd"/>
-      <w:r>
-        <w:rPr>
-          <w:rFonts w:eastAsia="Times New Roman" w:cs="Arial"/>
-          <w:spacing w:val="0"/>
-          <w:szCs w:val="20"/>
-          <w:lang w:val="en-AU" w:eastAsia="de-DE" w:bidi="ar-SA"/>
-        </w:rPr>
-        <w:t xml:space="preserve"> (table II).</w:t>
+        <w:t xml:space="preserve"> (</w:t>
+      </w:r>
+      <w:r>
+        <w:rPr>
+          <w:rFonts w:eastAsia="Times New Roman" w:cs="Arial"/>
+          <w:spacing w:val="0"/>
+          <w:szCs w:val="20"/>
+          <w:lang w:val="en-AU" w:eastAsia="de-DE" w:bidi="ar-SA"/>
+        </w:rPr>
+        <w:t>old T</w:t>
+      </w:r>
+      <w:r>
+        <w:rPr>
+          <w:rFonts w:eastAsia="Times New Roman" w:cs="Arial"/>
+          <w:spacing w:val="0"/>
+          <w:szCs w:val="20"/>
+          <w:lang w:val="en-AU" w:eastAsia="de-DE" w:bidi="ar-SA"/>
+        </w:rPr>
+        <w:t>able II</w:t>
+      </w:r>
+      <w:r>
+        <w:rPr>
+          <w:rFonts w:eastAsia="Times New Roman" w:cs="Arial"/>
+          <w:spacing w:val="0"/>
+          <w:szCs w:val="20"/>
+          <w:lang w:val="en-AU" w:eastAsia="de-DE" w:bidi="ar-SA"/>
+        </w:rPr>
+        <w:t>, now Fig. 8</w:t>
+      </w:r>
+      <w:r>
+        <w:rPr>
+          <w:rFonts w:eastAsia="Times New Roman" w:cs="Arial"/>
+          <w:spacing w:val="0"/>
+          <w:szCs w:val="20"/>
+          <w:lang w:val="en-AU" w:eastAsia="de-DE" w:bidi="ar-SA"/>
+        </w:rPr>
+        <w:t>).</w:t>
       </w:r>
       <w:r>
         <w:rPr>
@@ -1478,7 +1550,25 @@
           <w:szCs w:val="20"/>
           <w:lang w:val="en-AU" w:eastAsia="de-DE" w:bidi="ar-SA"/>
         </w:rPr>
-        <w:t xml:space="preserve">. </w:t>
+        <w:t>.</w:t>
+      </w:r>
+      <w:r>
+        <w:rPr>
+          <w:rFonts w:eastAsia="Times New Roman" w:cs="Arial"/>
+          <w:spacing w:val="0"/>
+          <w:szCs w:val="20"/>
+          <w:lang w:val="en-AU" w:eastAsia="de-DE" w:bidi="ar-SA"/>
+        </w:rPr>
+        <w:t xml:space="preserve"> We did the same for Table II, as to keep result representation </w:t>
+      </w:r>
+      <w:r>
+        <w:rPr>
+          <w:rFonts w:eastAsia="Times New Roman" w:cs="Arial"/>
+          <w:spacing w:val="0"/>
+          <w:szCs w:val="20"/>
+          <w:lang w:val="en-AU" w:eastAsia="de-DE" w:bidi="ar-SA"/>
+        </w:rPr>
+        <w:t>consistent.</w:t>
       </w:r>
     </w:p>
     <w:p>
@@ -1636,6 +1726,15 @@
           <w:lang w:val="en-AU" w:eastAsia="de-DE" w:bidi="ar-SA"/>
         </w:rPr>
         <w:t xml:space="preserve"> and made 31 changes</w:t>
+      </w:r>
+      <w:r>
+        <w:rPr>
+          <w:rFonts w:eastAsia="Times New Roman" w:cs="Arial"/>
+          <w:spacing w:val="0"/>
+          <w:szCs w:val="20"/>
+          <w:lang w:val="en-AU" w:eastAsia="de-DE" w:bidi="ar-SA"/>
+        </w:rPr>
+        <w:t xml:space="preserve"> related to this point</w:t>
       </w:r>
       <w:r>
         <w:rPr>

</xml_diff>

<commit_message>
answer questions reviewer two: cost functions
</commit_message>
<xml_diff>
--- a/submission_to_autonomous_intelligent_systems/re_submission/response.docx
+++ b/submission_to_autonomous_intelligent_systems/re_submission/response.docx
@@ -1454,17 +1454,26 @@
           <w:rFonts w:eastAsia="Times New Roman" w:cs="Arial"/>
           <w:spacing w:val="0"/>
           <w:szCs w:val="20"/>
+          <w:lang w:val="en-AU" w:eastAsia="de-DE" w:bidi="ar-SA"/>
+        </w:rPr>
+      </w:pPr>
+      <w:r>
+        <w:rPr>
+          <w:rFonts w:eastAsia="Times New Roman" w:cs="Arial"/>
+          <w:spacing w:val="0"/>
+          <w:szCs w:val="20"/>
+          <w:lang w:val="en-AU" w:eastAsia="de-DE" w:bidi="ar-SA"/>
+        </w:rPr>
+        <w:sym w:font="Wingdings" w:char="F0E0"/>
+      </w:r>
+      <w:r>
+        <w:rPr>
+          <w:rFonts w:eastAsia="Times New Roman" w:cs="Arial"/>
+          <w:spacing w:val="0"/>
+          <w:szCs w:val="20"/>
           <w:lang w:val="de-DE" w:eastAsia="de-DE" w:bidi="ar-SA"/>
         </w:rPr>
-      </w:pPr>
-      <w:r>
-        <w:rPr>
-          <w:rFonts w:eastAsia="Times New Roman" w:cs="Arial"/>
-          <w:spacing w:val="0"/>
-          <w:szCs w:val="20"/>
-          <w:lang w:val="en-AU" w:eastAsia="de-DE" w:bidi="ar-SA"/>
-        </w:rPr>
-        <w:sym w:font="Wingdings" w:char="F0E0"/>
+        <w:t xml:space="preserve"> Pseudocode: Hier weiß ich n</w:t>
       </w:r>
       <w:r>
         <w:rPr>
@@ -1473,15 +1482,6 @@
           <w:szCs w:val="20"/>
           <w:lang w:val="de-DE" w:eastAsia="de-DE" w:bidi="ar-SA"/>
         </w:rPr>
-        <w:t xml:space="preserve"> Pseudocode: Hier weiß ich n</w:t>
-      </w:r>
-      <w:r>
-        <w:rPr>
-          <w:rFonts w:eastAsia="Times New Roman" w:cs="Arial"/>
-          <w:spacing w:val="0"/>
-          <w:szCs w:val="20"/>
-          <w:lang w:val="de-DE" w:eastAsia="de-DE" w:bidi="ar-SA"/>
-        </w:rPr>
         <w:t xml:space="preserve">icht was er genau meint. Wenn wir das bestimmen können, wäre das einfach. </w:t>
       </w:r>
       <w:r>
@@ -1489,7 +1489,7 @@
           <w:rFonts w:eastAsia="Times New Roman" w:cs="Arial"/>
           <w:spacing w:val="0"/>
           <w:szCs w:val="20"/>
-          <w:lang w:val="de-DE" w:eastAsia="de-DE" w:bidi="ar-SA"/>
+          <w:lang w:val="en-AU" w:eastAsia="de-DE" w:bidi="ar-SA"/>
         </w:rPr>
         <w:t>(C, C)</w:t>
       </w:r>
@@ -2284,7 +2284,7 @@
           <w:rFonts w:eastAsia="Times New Roman" w:cs="Arial"/>
           <w:spacing w:val="0"/>
           <w:szCs w:val="20"/>
-          <w:lang w:val="de-DE" w:eastAsia="de-DE" w:bidi="ar-SA"/>
+          <w:lang w:val="en-AU" w:eastAsia="de-DE" w:bidi="ar-SA"/>
         </w:rPr>
       </w:pPr>
       <w:r>
@@ -2301,38 +2301,72 @@
           <w:rFonts w:eastAsia="Times New Roman" w:cs="Arial"/>
           <w:spacing w:val="0"/>
           <w:szCs w:val="20"/>
-          <w:lang w:val="de-DE" w:eastAsia="de-DE" w:bidi="ar-SA"/>
+          <w:lang w:val="en-AU" w:eastAsia="de-DE" w:bidi="ar-SA"/>
         </w:rPr>
         <w:t xml:space="preserve"> </w:t>
       </w:r>
-      <w:proofErr w:type="spellStart"/>
-      <w:r>
-        <w:rPr>
-          <w:rFonts w:eastAsia="Times New Roman" w:cs="Arial"/>
-          <w:spacing w:val="0"/>
-          <w:szCs w:val="20"/>
-          <w:lang w:val="de-DE" w:eastAsia="de-DE" w:bidi="ar-SA"/>
-        </w:rPr>
-        <w:t>Cost</w:t>
-      </w:r>
-      <w:proofErr w:type="spellEnd"/>
-      <w:r>
-        <w:rPr>
-          <w:rFonts w:eastAsia="Times New Roman" w:cs="Arial"/>
-          <w:spacing w:val="0"/>
-          <w:szCs w:val="20"/>
-          <w:lang w:val="de-DE" w:eastAsia="de-DE" w:bidi="ar-SA"/>
-        </w:rPr>
-        <w:t xml:space="preserve"> Vorzeichen von Gleichung (3) i</w:t>
-      </w:r>
-      <w:r>
-        <w:rPr>
-          <w:rFonts w:eastAsia="Times New Roman" w:cs="Arial"/>
-          <w:spacing w:val="0"/>
-          <w:szCs w:val="20"/>
-          <w:lang w:val="de-DE" w:eastAsia="de-DE" w:bidi="ar-SA"/>
-        </w:rPr>
-        <w:t>st einfach falsch bei uns. (MD)</w:t>
+      <w:r>
+        <w:rPr>
+          <w:rFonts w:eastAsia="Times New Roman" w:cs="Arial"/>
+          <w:spacing w:val="0"/>
+          <w:szCs w:val="20"/>
+          <w:lang w:val="en-AU" w:eastAsia="de-DE" w:bidi="ar-SA"/>
+        </w:rPr>
+        <w:t>This was well spotted</w:t>
+      </w:r>
+      <w:r>
+        <w:rPr>
+          <w:rFonts w:eastAsia="Times New Roman" w:cs="Arial"/>
+          <w:spacing w:val="0"/>
+          <w:szCs w:val="20"/>
+          <w:lang w:val="en-AU" w:eastAsia="de-DE" w:bidi="ar-SA"/>
+        </w:rPr>
+        <w:t>.</w:t>
+      </w:r>
+      <w:r>
+        <w:rPr>
+          <w:rFonts w:eastAsia="Times New Roman" w:cs="Arial"/>
+          <w:spacing w:val="0"/>
+          <w:szCs w:val="20"/>
+          <w:lang w:val="en-AU" w:eastAsia="de-DE" w:bidi="ar-SA"/>
+        </w:rPr>
+        <w:t xml:space="preserve"> </w:t>
+      </w:r>
+      <w:r>
+        <w:rPr>
+          <w:rFonts w:eastAsia="Times New Roman" w:cs="Arial"/>
+          <w:spacing w:val="0"/>
+          <w:szCs w:val="20"/>
+          <w:lang w:val="en-AU" w:eastAsia="de-DE" w:bidi="ar-SA"/>
+        </w:rPr>
+        <w:t>T</w:t>
+      </w:r>
+      <w:r>
+        <w:rPr>
+          <w:rFonts w:eastAsia="Times New Roman" w:cs="Arial"/>
+          <w:spacing w:val="0"/>
+          <w:szCs w:val="20"/>
+          <w:lang w:val="en-AU" w:eastAsia="de-DE" w:bidi="ar-SA"/>
+        </w:rPr>
+        <w:t xml:space="preserve">he sign of the loss function in equation (3) was </w:t>
+      </w:r>
+      <w:r>
+        <w:rPr>
+          <w:rFonts w:eastAsia="Times New Roman" w:cs="Arial"/>
+          <w:spacing w:val="0"/>
+          <w:szCs w:val="20"/>
+          <w:lang w:val="en-AU" w:eastAsia="de-DE" w:bidi="ar-SA"/>
+        </w:rPr>
+        <w:t xml:space="preserve">indeed wrong and is now </w:t>
+      </w:r>
+      <w:r>
+        <w:rPr>
+          <w:rFonts w:eastAsia="Times New Roman" w:cs="Arial"/>
+          <w:spacing w:val="0"/>
+          <w:szCs w:val="20"/>
+          <w:lang w:val="en-AU" w:eastAsia="de-DE" w:bidi="ar-SA"/>
+        </w:rPr>
+        <w:t>corrected.</w:t>
       </w:r>
     </w:p>
     <w:p>
@@ -2418,7 +2452,7 @@
           <w:color w:val="4472C4" w:themeColor="accent5"/>
           <w:spacing w:val="0"/>
           <w:szCs w:val="20"/>
-          <w:lang w:val="de-DE" w:eastAsia="de-DE" w:bidi="ar-SA"/>
+          <w:lang w:val="en-AU" w:eastAsia="de-DE" w:bidi="ar-SA"/>
         </w:rPr>
       </w:pPr>
       <w:r>
@@ -2435,19 +2469,46 @@
           <w:rFonts w:eastAsia="Times New Roman" w:cs="Arial"/>
           <w:spacing w:val="0"/>
           <w:szCs w:val="20"/>
-          <w:lang w:val="de-DE" w:eastAsia="de-DE" w:bidi="ar-SA"/>
+          <w:lang w:val="en-AU" w:eastAsia="de-DE" w:bidi="ar-SA"/>
         </w:rPr>
         <w:t xml:space="preserve"> </w:t>
       </w:r>
+      <w:r>
+        <w:rPr>
+          <w:rFonts w:eastAsia="Times New Roman" w:cs="Arial"/>
+          <w:spacing w:val="0"/>
+          <w:szCs w:val="20"/>
+          <w:lang w:val="en-AU" w:eastAsia="de-DE" w:bidi="ar-SA"/>
+        </w:rPr>
+        <w:t>We have re-written t</w:t>
+      </w:r>
+      <w:r>
+        <w:rPr>
+          <w:rFonts w:eastAsia="Times New Roman" w:cs="Arial"/>
+          <w:spacing w:val="0"/>
+          <w:szCs w:val="20"/>
+          <w:lang w:val="en-AU" w:eastAsia="de-DE" w:bidi="ar-SA"/>
+        </w:rPr>
+        <w:t xml:space="preserve">he one-hot vector explanation </w:t>
+      </w:r>
+      <w:r>
+        <w:rPr>
+          <w:rFonts w:eastAsia="Times New Roman" w:cs="Arial"/>
+          <w:spacing w:val="0"/>
+          <w:szCs w:val="20"/>
+          <w:lang w:val="en-AU" w:eastAsia="de-DE" w:bidi="ar-SA"/>
+        </w:rPr>
+        <w:t xml:space="preserve">for </w:t>
+      </w:r>
       <w:proofErr w:type="spellStart"/>
       <w:r>
         <w:rPr>
           <w:rFonts w:eastAsia="Times New Roman" w:cs="Arial"/>
           <w:spacing w:val="0"/>
           <w:szCs w:val="20"/>
-          <w:lang w:val="de-DE" w:eastAsia="de-DE" w:bidi="ar-SA"/>
-        </w:rPr>
-        <w:t>One</w:t>
+          <w:lang w:val="en-AU" w:eastAsia="de-DE" w:bidi="ar-SA"/>
+        </w:rPr>
+        <w:t>MANTa</w:t>
       </w:r>
       <w:proofErr w:type="spellEnd"/>
       <w:r>
@@ -2455,9 +2516,99 @@
           <w:rFonts w:eastAsia="Times New Roman" w:cs="Arial"/>
           <w:spacing w:val="0"/>
           <w:szCs w:val="20"/>
-          <w:lang w:val="de-DE" w:eastAsia="de-DE" w:bidi="ar-SA"/>
-        </w:rPr>
-        <w:t>-Hot: Kann ich nochmal rein gucken (MD)</w:t>
+          <w:lang w:val="en-AU" w:eastAsia="de-DE" w:bidi="ar-SA"/>
+        </w:rPr>
+        <w:t xml:space="preserve"> in section</w:t>
+      </w:r>
+      <w:r>
+        <w:rPr>
+          <w:rFonts w:eastAsia="Times New Roman" w:cs="Arial"/>
+          <w:spacing w:val="0"/>
+          <w:szCs w:val="20"/>
+          <w:lang w:val="en-AU" w:eastAsia="de-DE" w:bidi="ar-SA"/>
+        </w:rPr>
+        <w:t xml:space="preserve"> </w:t>
+      </w:r>
+      <w:r>
+        <w:rPr>
+          <w:rFonts w:eastAsia="Times New Roman" w:cs="Arial"/>
+          <w:spacing w:val="0"/>
+          <w:szCs w:val="20"/>
+          <w:lang w:val="en-AU" w:eastAsia="de-DE" w:bidi="ar-SA"/>
+        </w:rPr>
+        <w:t>IV</w:t>
+      </w:r>
+      <w:r>
+        <w:rPr>
+          <w:rFonts w:eastAsia="Times New Roman" w:cs="Arial"/>
+          <w:spacing w:val="0"/>
+          <w:szCs w:val="20"/>
+          <w:lang w:val="en-AU" w:eastAsia="de-DE" w:bidi="ar-SA"/>
+        </w:rPr>
+        <w:t>-</w:t>
+      </w:r>
+      <w:r>
+        <w:rPr>
+          <w:rFonts w:eastAsia="Times New Roman" w:cs="Arial"/>
+          <w:spacing w:val="0"/>
+          <w:szCs w:val="20"/>
+          <w:lang w:val="en-AU" w:eastAsia="de-DE" w:bidi="ar-SA"/>
+        </w:rPr>
+        <w:t>C</w:t>
+      </w:r>
+      <w:r>
+        <w:rPr>
+          <w:rFonts w:eastAsia="Times New Roman" w:cs="Arial"/>
+          <w:spacing w:val="0"/>
+          <w:szCs w:val="20"/>
+          <w:lang w:val="en-AU" w:eastAsia="de-DE" w:bidi="ar-SA"/>
+        </w:rPr>
+        <w:t xml:space="preserve"> to make it clearer which parts are one-hot encoded. The cost equation (</w:t>
+      </w:r>
+      <w:r>
+        <w:rPr>
+          <w:rFonts w:eastAsia="Times New Roman" w:cs="Arial"/>
+          <w:spacing w:val="0"/>
+          <w:szCs w:val="20"/>
+          <w:lang w:val="en-AU" w:eastAsia="de-DE" w:bidi="ar-SA"/>
+        </w:rPr>
+        <w:t>5</w:t>
+      </w:r>
+      <w:r>
+        <w:rPr>
+          <w:rFonts w:eastAsia="Times New Roman" w:cs="Arial"/>
+          <w:spacing w:val="0"/>
+          <w:szCs w:val="20"/>
+          <w:lang w:val="en-AU" w:eastAsia="de-DE" w:bidi="ar-SA"/>
+        </w:rPr>
+        <w:t>) was correct</w:t>
+      </w:r>
+      <w:r>
+        <w:rPr>
+          <w:rFonts w:eastAsia="Times New Roman" w:cs="Arial"/>
+          <w:spacing w:val="0"/>
+          <w:szCs w:val="20"/>
+          <w:lang w:val="en-AU" w:eastAsia="de-DE" w:bidi="ar-SA"/>
+        </w:rPr>
+        <w:t xml:space="preserve">, but we also added a note explaining the </w:t>
+      </w:r>
+      <w:r>
+        <w:rPr>
+          <w:rFonts w:eastAsia="Times New Roman" w:cs="Arial"/>
+          <w:spacing w:val="0"/>
+          <w:szCs w:val="20"/>
+          <w:lang w:val="en-AU" w:eastAsia="de-DE" w:bidi="ar-SA"/>
+        </w:rPr>
+        <w:t xml:space="preserve">connection between the </w:t>
+      </w:r>
+      <w:r>
+        <w:rPr>
+          <w:rFonts w:eastAsia="Times New Roman" w:cs="Arial"/>
+          <w:spacing w:val="0"/>
+          <w:szCs w:val="20"/>
+          <w:lang w:val="en-AU" w:eastAsia="de-DE" w:bidi="ar-SA"/>
+        </w:rPr>
+        <w:t>matrix entries of the prediction and the loss function.</w:t>
       </w:r>
     </w:p>
     <w:p>
@@ -2472,7 +2623,7 @@
           <w:color w:val="4472C4" w:themeColor="accent5"/>
           <w:spacing w:val="0"/>
           <w:szCs w:val="20"/>
-          <w:lang w:val="de-DE" w:eastAsia="de-DE" w:bidi="ar-SA"/>
+          <w:lang w:val="en-AU" w:eastAsia="de-DE" w:bidi="ar-SA"/>
         </w:rPr>
       </w:pPr>
     </w:p>
@@ -2544,6 +2695,15 @@
         </w:rPr>
         <w:t xml:space="preserve">urchgehen. </w:t>
       </w:r>
+      <w:r>
+        <w:rPr>
+          <w:rFonts w:eastAsia="Times New Roman" w:cs="Arial"/>
+          <w:spacing w:val="0"/>
+          <w:szCs w:val="20"/>
+          <w:lang w:val="de-DE" w:eastAsia="de-DE" w:bidi="ar-SA"/>
+        </w:rPr>
+        <w:t>(C, C)</w:t>
+      </w:r>
     </w:p>
     <w:p>
       <w:pPr>
@@ -2677,7 +2837,7 @@
           <w:color w:val="4472C4" w:themeColor="accent5"/>
           <w:spacing w:val="0"/>
           <w:szCs w:val="20"/>
-          <w:lang w:val="de-DE" w:eastAsia="de-DE" w:bidi="ar-SA"/>
+          <w:lang w:val="en-AU" w:eastAsia="de-DE" w:bidi="ar-SA"/>
         </w:rPr>
       </w:pPr>
       <w:r>
@@ -2705,7 +2865,88 @@
           <w:szCs w:val="20"/>
           <w:lang w:val="en-AU" w:eastAsia="de-DE" w:bidi="ar-SA"/>
         </w:rPr>
-        <w:t xml:space="preserve">Sehr </w:t>
+        <w:t>We carefully went through the manuscript and improved it at various places</w:t>
+      </w:r>
+      <w:r>
+        <w:rPr>
+          <w:rFonts w:eastAsia="Times New Roman" w:cs="Arial"/>
+          <w:spacing w:val="0"/>
+          <w:szCs w:val="20"/>
+          <w:lang w:val="en-AU" w:eastAsia="de-DE" w:bidi="ar-SA"/>
+        </w:rPr>
+        <w:t>.</w:t>
+      </w:r>
+      <w:r>
+        <w:rPr>
+          <w:rFonts w:eastAsia="Times New Roman" w:cs="Arial"/>
+          <w:spacing w:val="0"/>
+          <w:szCs w:val="20"/>
+          <w:lang w:val="en-AU" w:eastAsia="de-DE" w:bidi="ar-SA"/>
+        </w:rPr>
+        <w:t xml:space="preserve"> G</w:t>
+      </w:r>
+      <w:r>
+        <w:rPr>
+          <w:rFonts w:eastAsia="Times New Roman" w:cs="Arial"/>
+          <w:spacing w:val="0"/>
+          <w:szCs w:val="20"/>
+          <w:lang w:val="en-AU" w:eastAsia="de-DE" w:bidi="ar-SA"/>
+        </w:rPr>
+        <w:t xml:space="preserve">rammatical and spelling </w:t>
+      </w:r>
+      <w:r>
+        <w:rPr>
+          <w:rFonts w:eastAsia="Times New Roman" w:cs="Arial"/>
+          <w:spacing w:val="0"/>
+          <w:szCs w:val="20"/>
+          <w:lang w:val="en-AU" w:eastAsia="de-DE" w:bidi="ar-SA"/>
+        </w:rPr>
+        <w:t xml:space="preserve">corrections: </w:t>
+      </w:r>
+      <w:r>
+        <w:rPr>
+          <w:rFonts w:eastAsia="Times New Roman" w:cs="Arial"/>
+          <w:spacing w:val="0"/>
+          <w:szCs w:val="20"/>
+          <w:lang w:val="en-AU" w:eastAsia="de-DE" w:bidi="ar-SA"/>
+        </w:rPr>
+        <w:t>31</w:t>
+      </w:r>
+      <w:r>
+        <w:rPr>
+          <w:rFonts w:eastAsia="Times New Roman" w:cs="Arial"/>
+          <w:spacing w:val="0"/>
+          <w:szCs w:val="20"/>
+          <w:lang w:val="en-AU" w:eastAsia="de-DE" w:bidi="ar-SA"/>
+        </w:rPr>
+        <w:t xml:space="preserve"> changes</w:t>
+      </w:r>
+      <w:r>
+        <w:rPr>
+          <w:rFonts w:eastAsia="Times New Roman" w:cs="Arial"/>
+          <w:spacing w:val="0"/>
+          <w:szCs w:val="20"/>
+          <w:lang w:val="en-AU" w:eastAsia="de-DE" w:bidi="ar-SA"/>
+        </w:rPr>
+        <w:t xml:space="preserve">. New </w:t>
+      </w:r>
+      <w:r>
+        <w:rPr>
+          <w:rFonts w:eastAsia="Times New Roman" w:cs="Arial"/>
+          <w:spacing w:val="0"/>
+          <w:szCs w:val="20"/>
+          <w:lang w:val="en-AU" w:eastAsia="de-DE" w:bidi="ar-SA"/>
+        </w:rPr>
+        <w:t>relevant references: 1 added.</w:t>
+      </w:r>
+      <w:r>
+        <w:rPr>
+          <w:rFonts w:eastAsia="Times New Roman" w:cs="Arial"/>
+          <w:spacing w:val="0"/>
+          <w:szCs w:val="20"/>
+          <w:lang w:val="en-AU" w:eastAsia="de-DE" w:bidi="ar-SA"/>
+        </w:rPr>
+        <w:t xml:space="preserve"> […to be </w:t>
       </w:r>
       <w:proofErr w:type="spellStart"/>
       <w:r>
@@ -2715,7 +2956,7 @@
           <w:szCs w:val="20"/>
           <w:lang w:val="en-AU" w:eastAsia="de-DE" w:bidi="ar-SA"/>
         </w:rPr>
-        <w:t>schwammig</w:t>
+        <w:t>extened</w:t>
       </w:r>
       <w:proofErr w:type="spellEnd"/>
       <w:r>
@@ -2725,25 +2966,7 @@
           <w:szCs w:val="20"/>
           <w:lang w:val="en-AU" w:eastAsia="de-DE" w:bidi="ar-SA"/>
         </w:rPr>
-        <w:t xml:space="preserve">. </w:t>
-      </w:r>
-      <w:r>
-        <w:rPr>
-          <w:rFonts w:eastAsia="Times New Roman" w:cs="Arial"/>
-          <w:spacing w:val="0"/>
-          <w:szCs w:val="20"/>
-          <w:lang w:val="de-DE" w:eastAsia="de-DE" w:bidi="ar-SA"/>
-        </w:rPr>
-        <w:t>Hier sollten wi</w:t>
-      </w:r>
-      <w:r>
-        <w:rPr>
-          <w:rFonts w:eastAsia="Times New Roman" w:cs="Arial"/>
-          <w:spacing w:val="0"/>
-          <w:szCs w:val="20"/>
-          <w:lang w:val="de-DE" w:eastAsia="de-DE" w:bidi="ar-SA"/>
-        </w:rPr>
-        <w:t>r nochmal gucken, ob wir Referenzen vergessen haben und auch über die Sprache gucken (alle)</w:t>
+        <w:t xml:space="preserve"> by all…]</w:t>
       </w:r>
     </w:p>
     <w:p>
@@ -2757,7 +2980,7 @@
           <w:rFonts w:eastAsia="Times New Roman" w:cs="Arial"/>
           <w:spacing w:val="0"/>
           <w:szCs w:val="20"/>
-          <w:lang w:val="de-DE" w:eastAsia="de-DE" w:bidi="ar-SA"/>
+          <w:lang w:val="en-AU" w:eastAsia="de-DE" w:bidi="ar-SA"/>
         </w:rPr>
       </w:pPr>
     </w:p>

</xml_diff>

<commit_message>
added training details and improved references
</commit_message>
<xml_diff>
--- a/submission_to_autonomous_intelligent_systems/re_submission/response.docx
+++ b/submission_to_autonomous_intelligent_systems/re_submission/response.docx
@@ -721,29 +721,7 @@
           <w:szCs w:val="20"/>
           <w:lang w:val="en-AU" w:eastAsia="de-DE" w:bidi="ar-SA"/>
         </w:rPr>
-        <w:t xml:space="preserve">2. To simulate more realistic sensor data, artificial noise is introduced. Is this artificial noise reasonable? Please </w:t>
-      </w:r>
-      <w:proofErr w:type="spellStart"/>
-      <w:r>
-        <w:rPr>
-          <w:rFonts w:eastAsia="Times New Roman" w:cs="Arial"/>
-          <w:color w:val="4472C4" w:themeColor="accent5"/>
-          <w:spacing w:val="0"/>
-          <w:szCs w:val="20"/>
-          <w:lang w:val="en-AU" w:eastAsia="de-DE" w:bidi="ar-SA"/>
-        </w:rPr>
-        <w:t>analyze</w:t>
-      </w:r>
-      <w:proofErr w:type="spellEnd"/>
-      <w:r>
-        <w:rPr>
-          <w:rFonts w:eastAsia="Times New Roman" w:cs="Arial"/>
-          <w:color w:val="4472C4" w:themeColor="accent5"/>
-          <w:spacing w:val="0"/>
-          <w:szCs w:val="20"/>
-          <w:lang w:val="en-AU" w:eastAsia="de-DE" w:bidi="ar-SA"/>
-        </w:rPr>
-        <w:t xml:space="preserve"> whether it is simple Gaussian white noise or a more complex type. </w:t>
+        <w:t xml:space="preserve">2. To simulate more realistic sensor data, artificial noise is introduced. Is this artificial noise reasonable? Please analyze whether it is simple Gaussian white noise or a more complex type. </w:t>
       </w:r>
       <w:r>
         <w:rPr>
@@ -1544,7 +1522,6 @@
         </w:rPr>
         <w:t>W</w:t>
       </w:r>
-      <w:proofErr w:type="spellStart"/>
       <w:r>
         <w:rPr>
           <w:rFonts w:eastAsia="Times New Roman" w:cs="Arial"/>
@@ -1552,17 +1529,7 @@
           <w:szCs w:val="20"/>
           <w:lang w:val="en-GB" w:eastAsia="de-DE" w:bidi="ar-SA"/>
         </w:rPr>
-        <w:t>e</w:t>
-      </w:r>
-      <w:proofErr w:type="spellEnd"/>
-      <w:r>
-        <w:rPr>
-          <w:rFonts w:eastAsia="Times New Roman" w:cs="Arial"/>
-          <w:spacing w:val="0"/>
-          <w:szCs w:val="20"/>
-          <w:lang w:val="en-GB" w:eastAsia="de-DE" w:bidi="ar-SA"/>
-        </w:rPr>
-        <w:t xml:space="preserve"> added a concise pseudo-code description to explicitly formalize the temporal execution order and decision logic of the proposed Tracking-by-Detection pipeline</w:t>
+        <w:t>e added a concise pseudo-code description to explicitly formalize the temporal execution order and decision logic of the proposed Tracking-by-Detection pipeline</w:t>
       </w:r>
       <w:r>
         <w:rPr>
@@ -2353,27 +2320,7 @@
           <w:szCs w:val="20"/>
           <w:lang w:val="en-GB" w:eastAsia="de-DE" w:bidi="ar-SA"/>
         </w:rPr>
-        <w:t xml:space="preserve"> of SPENT, SANT, and </w:t>
-      </w:r>
-      <w:proofErr w:type="spellStart"/>
-      <w:r>
-        <w:rPr>
-          <w:rFonts w:eastAsia="Times New Roman" w:cs="Arial"/>
-          <w:spacing w:val="0"/>
-          <w:szCs w:val="20"/>
-          <w:lang w:val="en-GB" w:eastAsia="de-DE" w:bidi="ar-SA"/>
-        </w:rPr>
-        <w:t>MANTa</w:t>
-      </w:r>
-      <w:proofErr w:type="spellEnd"/>
-      <w:r>
-        <w:rPr>
-          <w:rFonts w:eastAsia="Times New Roman" w:cs="Arial"/>
-          <w:spacing w:val="0"/>
-          <w:szCs w:val="20"/>
-          <w:lang w:val="en-GB" w:eastAsia="de-DE" w:bidi="ar-SA"/>
-        </w:rPr>
-        <w:t>.</w:t>
+        <w:t xml:space="preserve"> of SPENT, SANT, and MANTa.</w:t>
       </w:r>
       <w:r>
         <w:rPr>
@@ -2490,29 +2437,7 @@
           <w:szCs w:val="20"/>
           <w:lang w:val="en-AU" w:eastAsia="de-DE" w:bidi="ar-SA"/>
         </w:rPr>
-        <w:t xml:space="preserve">3. Per-track </w:t>
-      </w:r>
-      <w:proofErr w:type="spellStart"/>
-      <w:r>
-        <w:rPr>
-          <w:rFonts w:eastAsia="Times New Roman" w:cs="Arial"/>
-          <w:color w:val="4472C4" w:themeColor="accent5"/>
-          <w:spacing w:val="0"/>
-          <w:szCs w:val="20"/>
-          <w:lang w:val="en-AU" w:eastAsia="de-DE" w:bidi="ar-SA"/>
-        </w:rPr>
-        <w:t>softmax</w:t>
-      </w:r>
-      <w:proofErr w:type="spellEnd"/>
-      <w:r>
-        <w:rPr>
-          <w:rFonts w:eastAsia="Times New Roman" w:cs="Arial"/>
-          <w:color w:val="4472C4" w:themeColor="accent5"/>
-          <w:spacing w:val="0"/>
-          <w:szCs w:val="20"/>
-          <w:lang w:val="en-AU" w:eastAsia="de-DE" w:bidi="ar-SA"/>
-        </w:rPr>
-        <w:t xml:space="preserve"> classification does not guarantee a feasible global assignment (multiple tracks can pick the same measurement);</w:t>
+        <w:t>3. Per-track softmax classification does not guarantee a feasible global assignment (multiple tracks can pick the same measurement);</w:t>
       </w:r>
     </w:p>
     <w:p>
@@ -2576,25 +2501,7 @@
           <w:lang w:val="en-GB" w:eastAsia="de-DE"/>
         </w:rPr>
         <w:br/>
-        <w:t xml:space="preserve">Indeed, the per-track </w:t>
-      </w:r>
-      <w:proofErr w:type="spellStart"/>
-      <w:r>
-        <w:rPr>
-          <w:rFonts w:eastAsia="Times New Roman" w:cs="Arial"/>
-          <w:szCs w:val="20"/>
-          <w:lang w:val="en-GB" w:eastAsia="de-DE"/>
-        </w:rPr>
-        <w:t>softmax</w:t>
-      </w:r>
-      <w:proofErr w:type="spellEnd"/>
-      <w:r>
-        <w:rPr>
-          <w:rFonts w:eastAsia="Times New Roman" w:cs="Arial"/>
-          <w:szCs w:val="20"/>
-          <w:lang w:val="en-GB" w:eastAsia="de-DE"/>
-        </w:rPr>
-        <w:t xml:space="preserve"> classification used in SANT</w:t>
+        <w:t>Indeed, the per-track softmax classification used in SANT</w:t>
       </w:r>
       <w:r>
         <w:rPr>
@@ -3257,17 +3164,12 @@
           <w:color w:val="FF0000"/>
           <w:spacing w:val="0"/>
           <w:szCs w:val="20"/>
-          <w:lang w:val="en-AU" w:eastAsia="de-DE" w:bidi="ar-SA"/>
-        </w:rPr>
-      </w:pPr>
-    </w:p>
-    <w:p>
-      <w:pPr>
-        <w:pStyle w:val="Listenabsatz"/>
-        <w:numPr>
-          <w:ilvl w:val="0"/>
-          <w:numId w:val="12"/>
-        </w:numPr>
+          <w:lang w:val="en-GB" w:eastAsia="de-DE" w:bidi="ar-SA"/>
+        </w:rPr>
+      </w:pPr>
+    </w:p>
+    <w:p>
+      <w:pPr>
         <w:autoSpaceDE w:val="0"/>
         <w:autoSpaceDN w:val="0"/>
         <w:adjustRightInd w:val="0"/>
@@ -3275,19 +3177,46 @@
         <w:contextualSpacing w:val="0"/>
         <w:rPr>
           <w:rFonts w:eastAsia="Times New Roman" w:cs="Arial"/>
-          <w:color w:val="FF0000"/>
-          <w:szCs w:val="20"/>
-          <w:lang w:eastAsia="de-DE"/>
-        </w:rPr>
-      </w:pPr>
-      <w:r>
-        <w:rPr>
-          <w:rFonts w:eastAsia="Times New Roman" w:cs="Arial"/>
-          <w:color w:val="FF0000"/>
-          <w:szCs w:val="20"/>
-          <w:lang w:eastAsia="de-DE"/>
-        </w:rPr>
-        <w:t>TODO</w:t>
+          <w:spacing w:val="0"/>
+          <w:szCs w:val="20"/>
+          <w:lang w:val="en-GB" w:eastAsia="de-DE" w:bidi="ar-SA"/>
+        </w:rPr>
+      </w:pPr>
+      <w:r>
+        <w:rPr>
+          <w:rFonts w:eastAsia="Times New Roman" w:cs="Arial"/>
+          <w:spacing w:val="0"/>
+          <w:szCs w:val="20"/>
+          <w:lang w:val="en-AU" w:eastAsia="de-DE" w:bidi="ar-SA"/>
+        </w:rPr>
+        <w:sym w:font="Wingdings" w:char="F0E0"/>
+      </w:r>
+      <w:r>
+        <w:rPr>
+          <w:rFonts w:eastAsia="Times New Roman" w:cs="Arial"/>
+          <w:spacing w:val="0"/>
+          <w:szCs w:val="20"/>
+          <w:lang w:val="en-AU" w:eastAsia="de-DE" w:bidi="ar-SA"/>
+        </w:rPr>
+        <w:t xml:space="preserve"> </w:t>
+      </w:r>
+      <w:r>
+        <w:rPr>
+          <w:rFonts w:eastAsia="Times New Roman" w:cs="Arial"/>
+          <w:spacing w:val="0"/>
+          <w:szCs w:val="20"/>
+          <w:lang w:val="en-GB" w:eastAsia="de-DE" w:bidi="ar-SA"/>
+        </w:rPr>
+        <w:t xml:space="preserve">We </w:t>
+      </w:r>
+      <w:r>
+        <w:rPr>
+          <w:rFonts w:eastAsia="Times New Roman" w:cs="Arial"/>
+          <w:spacing w:val="0"/>
+          <w:szCs w:val="20"/>
+          <w:lang w:val="en-GB" w:eastAsia="de-DE" w:bidi="ar-SA"/>
+        </w:rPr>
+        <w:t>acknowledge this important concern and have added comprehensive training details to the revised manuscript. The configuration is now documented in a dedicated section (Section IV, c) overall training setup)</w:t>
       </w:r>
     </w:p>
     <w:p>
@@ -3377,7 +3306,32 @@
           <w:szCs w:val="20"/>
           <w:lang w:val="en-AU" w:eastAsia="de-DE" w:bidi="ar-SA"/>
         </w:rPr>
-        <w:t xml:space="preserve"> Added </w:t>
+        <w:t xml:space="preserve"> </w:t>
+      </w:r>
+      <w:r>
+        <w:rPr>
+          <w:rFonts w:eastAsia="Times New Roman" w:cs="Arial"/>
+          <w:szCs w:val="20"/>
+          <w:lang w:val="en-GB" w:eastAsia="de-DE"/>
+        </w:rPr>
+        <w:t>We thank the reviewer for highlighting this</w:t>
+      </w:r>
+      <w:r>
+        <w:rPr>
+          <w:rFonts w:eastAsia="Times New Roman" w:cs="Arial"/>
+          <w:szCs w:val="20"/>
+          <w:lang w:val="en-GB" w:eastAsia="de-DE"/>
+        </w:rPr>
+        <w:t xml:space="preserve"> and a</w:t>
+      </w:r>
+      <w:r>
+        <w:rPr>
+          <w:rFonts w:eastAsia="Times New Roman" w:cs="Arial"/>
+          <w:spacing w:val="0"/>
+          <w:szCs w:val="20"/>
+          <w:lang w:val="en-AU" w:eastAsia="de-DE" w:bidi="ar-SA"/>
+        </w:rPr>
+        <w:t xml:space="preserve">dded </w:t>
       </w:r>
       <w:r>
         <w:rPr>
@@ -3396,6 +3350,15 @@
           <w:lang w:val="en-AU" w:eastAsia="de-DE" w:bidi="ar-SA"/>
         </w:rPr>
         <w:t xml:space="preserve">in </w:t>
+      </w:r>
+      <w:r>
+        <w:rPr>
+          <w:rFonts w:eastAsia="Times New Roman" w:cs="Arial"/>
+          <w:spacing w:val="0"/>
+          <w:szCs w:val="20"/>
+          <w:lang w:val="en-AU" w:eastAsia="de-DE" w:bidi="ar-SA"/>
+        </w:rPr>
+        <w:t xml:space="preserve">section V. </w:t>
       </w:r>
       <w:r>
         <w:rPr>
@@ -3522,7 +3485,16 @@
           <w:szCs w:val="20"/>
           <w:lang w:val="en-AU" w:eastAsia="de-DE" w:bidi="ar-SA"/>
         </w:rPr>
-        <w:t xml:space="preserve"> Grammatical and spelling corrections: 31</w:t>
+        <w:t xml:space="preserve"> Grammatical and spelling corrections: 3</w:t>
+      </w:r>
+      <w:r>
+        <w:rPr>
+          <w:rFonts w:eastAsia="Times New Roman" w:cs="Arial"/>
+          <w:spacing w:val="0"/>
+          <w:szCs w:val="20"/>
+          <w:lang w:val="en-AU" w:eastAsia="de-DE" w:bidi="ar-SA"/>
+        </w:rPr>
+        <w:t>2</w:t>
       </w:r>
       <w:r>
         <w:rPr>
@@ -3549,7 +3521,25 @@
           <w:szCs w:val="20"/>
           <w:lang w:val="en-AU" w:eastAsia="de-DE" w:bidi="ar-SA"/>
         </w:rPr>
-        <w:t>relevant references: 1 added.</w:t>
+        <w:t xml:space="preserve">relevant references: </w:t>
+      </w:r>
+      <w:r>
+        <w:rPr>
+          <w:rFonts w:eastAsia="Times New Roman" w:cs="Arial"/>
+          <w:spacing w:val="0"/>
+          <w:szCs w:val="20"/>
+          <w:lang w:val="en-AU" w:eastAsia="de-DE" w:bidi="ar-SA"/>
+        </w:rPr>
+        <w:t>2</w:t>
+      </w:r>
+      <w:r>
+        <w:rPr>
+          <w:rFonts w:eastAsia="Times New Roman" w:cs="Arial"/>
+          <w:spacing w:val="0"/>
+          <w:szCs w:val="20"/>
+          <w:lang w:val="en-AU" w:eastAsia="de-DE" w:bidi="ar-SA"/>
+        </w:rPr>
+        <w:t xml:space="preserve"> added.</w:t>
       </w:r>
       <w:r>
         <w:rPr>
@@ -3559,49 +3549,6 @@
           <w:lang w:val="en-AU" w:eastAsia="de-DE" w:bidi="ar-SA"/>
         </w:rPr>
         <w:t xml:space="preserve"> </w:t>
-      </w:r>
-    </w:p>
-    <w:p>
-      <w:pPr>
-        <w:autoSpaceDE w:val="0"/>
-        <w:autoSpaceDN w:val="0"/>
-        <w:adjustRightInd w:val="0"/>
-        <w:spacing w:after="0" w:line="240" w:lineRule="auto"/>
-        <w:contextualSpacing w:val="0"/>
-        <w:rPr>
-          <w:rFonts w:eastAsia="Times New Roman" w:cs="Arial"/>
-          <w:spacing w:val="0"/>
-          <w:szCs w:val="20"/>
-          <w:lang w:val="en-AU" w:eastAsia="de-DE" w:bidi="ar-SA"/>
-        </w:rPr>
-      </w:pPr>
-    </w:p>
-    <w:p>
-      <w:pPr>
-        <w:pStyle w:val="Listenabsatz"/>
-        <w:numPr>
-          <w:ilvl w:val="0"/>
-          <w:numId w:val="12"/>
-        </w:numPr>
-        <w:autoSpaceDE w:val="0"/>
-        <w:autoSpaceDN w:val="0"/>
-        <w:adjustRightInd w:val="0"/>
-        <w:spacing w:after="0" w:line="240" w:lineRule="auto"/>
-        <w:contextualSpacing w:val="0"/>
-        <w:rPr>
-          <w:rFonts w:eastAsia="Times New Roman" w:cs="Arial"/>
-          <w:szCs w:val="20"/>
-          <w:lang w:val="en-AU" w:eastAsia="de-DE"/>
-        </w:rPr>
-      </w:pPr>
-      <w:r>
-        <w:rPr>
-          <w:rFonts w:eastAsia="Times New Roman" w:cs="Arial"/>
-          <w:color w:val="FF0000"/>
-          <w:szCs w:val="20"/>
-          <w:lang w:val="en-GB" w:eastAsia="de-DE"/>
-        </w:rPr>
-        <w:t>TODO</w:t>
       </w:r>
     </w:p>
     <w:p>
@@ -3829,11 +3776,9 @@
         <w:pStyle w:val="03DHBWRechteSpalte"/>
         <w:framePr w:h="4264" w:hRule="exact" w:wrap="notBeside" w:x="8988" w:y="2694"/>
       </w:pPr>
-      <w:proofErr w:type="spellStart"/>
       <w:r>
         <w:t>matthias.drueppel</w:t>
       </w:r>
-      <w:proofErr w:type="spellEnd"/>
       <w:r>
         <w:t>@</w:t>
       </w:r>
@@ -6983,7 +6928,6 @@
   <w:style w:type="character" w:default="1" w:styleId="Absatz-Standardschriftart">
     <w:name w:val="Default Paragraph Font"/>
     <w:uiPriority w:val="1"/>
-    <w:semiHidden/>
     <w:unhideWhenUsed/>
   </w:style>
   <w:style w:type="table" w:default="1" w:styleId="NormaleTabelle">

</xml_diff>

<commit_message>
add additional references to the manuscript and optimize the layout of the illustrations
</commit_message>
<xml_diff>
--- a/submission_to_autonomous_intelligent_systems/re_submission/response.docx
+++ b/submission_to_autonomous_intelligent_systems/re_submission/response.docx
@@ -3231,7 +3231,7 @@
           <w:color w:val="4472C4" w:themeColor="accent5"/>
           <w:spacing w:val="0"/>
           <w:szCs w:val="20"/>
-          <w:lang w:val="de-DE" w:eastAsia="de-DE" w:bidi="ar-SA"/>
+          <w:lang w:val="en-GB" w:eastAsia="de-DE" w:bidi="ar-SA"/>
         </w:rPr>
       </w:pPr>
     </w:p>
@@ -3530,7 +3530,7 @@
           <w:szCs w:val="20"/>
           <w:lang w:val="en-AU" w:eastAsia="de-DE" w:bidi="ar-SA"/>
         </w:rPr>
-        <w:t>2</w:t>
+        <w:t>7</w:t>
       </w:r>
       <w:r>
         <w:rPr>
@@ -6928,6 +6928,7 @@
   <w:style w:type="character" w:default="1" w:styleId="Absatz-Standardschriftart">
     <w:name w:val="Default Paragraph Font"/>
     <w:uiPriority w:val="1"/>
+    <w:semiHidden/>
     <w:unhideWhenUsed/>
   </w:style>
   <w:style w:type="table" w:default="1" w:styleId="NormaleTabelle">

</xml_diff>